<commit_message>
DOC2 : captures récentes dans la présentation, les Word et le guide
Co-Authored-By: Claude Opus 5.5 <noreply@anthropic.com>
</commit_message>
<xml_diff>
--- a/docs/HuisClos-Architecture.docx
+++ b/docs/HuisClos-Architecture.docx
@@ -11,7 +11,7 @@
           <w:noProof/>
         </w:rPr>
         <w:drawing>
-          <wp:inline distT="0" distB="0" distL="0" distR="0" wp14:anchorId="01BEB8EC" wp14:editId="0CC8F008">
+          <wp:inline distT="0" distB="0" distL="0" distR="0" wp14:anchorId="46DE7E47" wp14:editId="609F3CF7">
             <wp:extent cx="936000" cy="936000"/>
             <wp:effectExtent l="0" t="0" r="0" b="0"/>
             <wp:docPr id="1" name="Picture 1"/>
@@ -145,7 +145,7 @@
       <w:r>
         <w:fldChar w:fldCharType="separate"/>
       </w:r>
-      <w:hyperlink w:anchor="_Toc244123703" w:history="1">
+      <w:hyperlink w:anchor="_Toc244124672" w:history="1">
         <w:r>
           <w:rPr>
             <w:rStyle w:val="Lienhypertexte"/>
@@ -172,7 +172,7 @@
             <w:noProof/>
             <w:webHidden/>
           </w:rPr>
-          <w:instrText xml:space="preserve"> PAGEREF _Toc244123703 \h </w:instrText>
+          <w:instrText xml:space="preserve"> PAGEREF _Toc244124672 \h </w:instrText>
         </w:r>
         <w:r>
           <w:rPr>
@@ -213,7 +213,7 @@
           <w:noProof/>
         </w:rPr>
       </w:pPr>
-      <w:hyperlink w:anchor="_Toc244123704" w:history="1">
+      <w:hyperlink w:anchor="_Toc244124673" w:history="1">
         <w:r>
           <w:rPr>
             <w:rStyle w:val="Lienhypertexte"/>
@@ -240,7 +240,7 @@
             <w:noProof/>
             <w:webHidden/>
           </w:rPr>
-          <w:instrText xml:space="preserve"> PAGEREF _Toc244123704 \h </w:instrText>
+          <w:instrText xml:space="preserve"> PAGEREF _Toc244124673 \h </w:instrText>
         </w:r>
         <w:r>
           <w:rPr>
@@ -281,7 +281,7 @@
           <w:noProof/>
         </w:rPr>
       </w:pPr>
-      <w:hyperlink w:anchor="_Toc244123705" w:history="1">
+      <w:hyperlink w:anchor="_Toc244124674" w:history="1">
         <w:r>
           <w:rPr>
             <w:rStyle w:val="Lienhypertexte"/>
@@ -308,75 +308,7 @@
             <w:noProof/>
             <w:webHidden/>
           </w:rPr>
-          <w:instrText xml:space="preserve"> PAGEREF _Toc244123705 \h </w:instrText>
-        </w:r>
-        <w:r>
-          <w:rPr>
-            <w:noProof/>
-            <w:webHidden/>
-          </w:rPr>
-        </w:r>
-        <w:r>
-          <w:rPr>
-            <w:noProof/>
-            <w:webHidden/>
-          </w:rPr>
-          <w:fldChar w:fldCharType="separate"/>
-        </w:r>
-        <w:r>
-          <w:rPr>
-            <w:noProof/>
-            <w:webHidden/>
-          </w:rPr>
-          <w:t>4</w:t>
-        </w:r>
-        <w:r>
-          <w:rPr>
-            <w:noProof/>
-            <w:webHidden/>
-          </w:rPr>
-          <w:fldChar w:fldCharType="end"/>
-        </w:r>
-      </w:hyperlink>
-    </w:p>
-    <w:p>
-      <w:pPr>
-        <w:pStyle w:val="TM1"/>
-        <w:tabs>
-          <w:tab w:val="right" w:leader="dot" w:pos="9402"/>
-        </w:tabs>
-        <w:rPr>
-          <w:noProof/>
-        </w:rPr>
-      </w:pPr>
-      <w:hyperlink w:anchor="_Toc244123706" w:history="1">
-        <w:r>
-          <w:rPr>
-            <w:rStyle w:val="Lienhypertexte"/>
-            <w:noProof/>
-          </w:rPr>
-          <w:t>4. The mapping table, kept apart</w:t>
-        </w:r>
-        <w:r>
-          <w:rPr>
-            <w:noProof/>
-            <w:webHidden/>
-          </w:rPr>
-          <w:tab/>
-        </w:r>
-        <w:r>
-          <w:rPr>
-            <w:noProof/>
-            <w:webHidden/>
-          </w:rPr>
-          <w:fldChar w:fldCharType="begin"/>
-        </w:r>
-        <w:r>
-          <w:rPr>
-            <w:noProof/>
-            <w:webHidden/>
-          </w:rPr>
-          <w:instrText xml:space="preserve"> PAGEREF _Toc244123706 \h </w:instrText>
+          <w:instrText xml:space="preserve"> PAGEREF _Toc244124674 \h </w:instrText>
         </w:r>
         <w:r>
           <w:rPr>
@@ -417,13 +349,13 @@
           <w:noProof/>
         </w:rPr>
       </w:pPr>
-      <w:hyperlink w:anchor="_Toc244123707" w:history="1">
+      <w:hyperlink w:anchor="_Toc244124675" w:history="1">
         <w:r>
           <w:rPr>
             <w:rStyle w:val="Lienhypertexte"/>
             <w:noProof/>
           </w:rPr>
-          <w:t>5. Module families</w:t>
+          <w:t>4. The mapping table, kept apart</w:t>
         </w:r>
         <w:r>
           <w:rPr>
@@ -444,7 +376,7 @@
             <w:noProof/>
             <w:webHidden/>
           </w:rPr>
-          <w:instrText xml:space="preserve"> PAGEREF _Toc244123707 \h </w:instrText>
+          <w:instrText xml:space="preserve"> PAGEREF _Toc244124675 \h </w:instrText>
         </w:r>
         <w:r>
           <w:rPr>
@@ -485,13 +417,13 @@
           <w:noProof/>
         </w:rPr>
       </w:pPr>
-      <w:hyperlink w:anchor="_Toc244123708" w:history="1">
+      <w:hyperlink w:anchor="_Toc244124676" w:history="1">
         <w:r>
           <w:rPr>
             <w:rStyle w:val="Lienhypertexte"/>
             <w:noProof/>
           </w:rPr>
-          <w:t>6. Three independent settings</w:t>
+          <w:t>5. Module families</w:t>
         </w:r>
         <w:r>
           <w:rPr>
@@ -512,7 +444,7 @@
             <w:noProof/>
             <w:webHidden/>
           </w:rPr>
-          <w:instrText xml:space="preserve"> PAGEREF _Toc244123708 \h </w:instrText>
+          <w:instrText xml:space="preserve"> PAGEREF _Toc244124676 \h </w:instrText>
         </w:r>
         <w:r>
           <w:rPr>
@@ -553,13 +485,13 @@
           <w:noProof/>
         </w:rPr>
       </w:pPr>
-      <w:hyperlink w:anchor="_Toc244123709" w:history="1">
+      <w:hyperlink w:anchor="_Toc244124677" w:history="1">
         <w:r>
           <w:rPr>
             <w:rStyle w:val="Lienhypertexte"/>
             <w:noProof/>
           </w:rPr>
-          <w:t>7. Profiles and explicit fallback</w:t>
+          <w:t>6. Three independent settings</w:t>
         </w:r>
         <w:r>
           <w:rPr>
@@ -580,7 +512,7 @@
             <w:noProof/>
             <w:webHidden/>
           </w:rPr>
-          <w:instrText xml:space="preserve"> PAGEREF _Toc244123709 \h </w:instrText>
+          <w:instrText xml:space="preserve"> PAGEREF _Toc244124677 \h </w:instrText>
         </w:r>
         <w:r>
           <w:rPr>
@@ -621,13 +553,13 @@
           <w:noProof/>
         </w:rPr>
       </w:pPr>
-      <w:hyperlink w:anchor="_Toc244123710" w:history="1">
+      <w:hyperlink w:anchor="_Toc244124678" w:history="1">
         <w:r>
           <w:rPr>
             <w:rStyle w:val="Lienhypertexte"/>
             <w:noProof/>
           </w:rPr>
-          <w:t>8. Stale states</w:t>
+          <w:t>7. Profiles and explicit fallback</w:t>
         </w:r>
         <w:r>
           <w:rPr>
@@ -648,143 +580,7 @@
             <w:noProof/>
             <w:webHidden/>
           </w:rPr>
-          <w:instrText xml:space="preserve"> PAGEREF _Toc244123710 \h </w:instrText>
-        </w:r>
-        <w:r>
-          <w:rPr>
-            <w:noProof/>
-            <w:webHidden/>
-          </w:rPr>
-        </w:r>
-        <w:r>
-          <w:rPr>
-            <w:noProof/>
-            <w:webHidden/>
-          </w:rPr>
-          <w:fldChar w:fldCharType="separate"/>
-        </w:r>
-        <w:r>
-          <w:rPr>
-            <w:noProof/>
-            <w:webHidden/>
-          </w:rPr>
-          <w:t>6</w:t>
-        </w:r>
-        <w:r>
-          <w:rPr>
-            <w:noProof/>
-            <w:webHidden/>
-          </w:rPr>
-          <w:fldChar w:fldCharType="end"/>
-        </w:r>
-      </w:hyperlink>
-    </w:p>
-    <w:p>
-      <w:pPr>
-        <w:pStyle w:val="TM1"/>
-        <w:tabs>
-          <w:tab w:val="right" w:leader="dot" w:pos="9402"/>
-        </w:tabs>
-        <w:rPr>
-          <w:noProof/>
-        </w:rPr>
-      </w:pPr>
-      <w:hyperlink w:anchor="_Toc244123711" w:history="1">
-        <w:r>
-          <w:rPr>
-            <w:rStyle w:val="Lienhypertexte"/>
-            <w:noProof/>
-          </w:rPr>
-          <w:t>9. Error handling</w:t>
-        </w:r>
-        <w:r>
-          <w:rPr>
-            <w:noProof/>
-            <w:webHidden/>
-          </w:rPr>
-          <w:tab/>
-        </w:r>
-        <w:r>
-          <w:rPr>
-            <w:noProof/>
-            <w:webHidden/>
-          </w:rPr>
-          <w:fldChar w:fldCharType="begin"/>
-        </w:r>
-        <w:r>
-          <w:rPr>
-            <w:noProof/>
-            <w:webHidden/>
-          </w:rPr>
-          <w:instrText xml:space="preserve"> PAGEREF _Toc244123711 \h </w:instrText>
-        </w:r>
-        <w:r>
-          <w:rPr>
-            <w:noProof/>
-            <w:webHidden/>
-          </w:rPr>
-        </w:r>
-        <w:r>
-          <w:rPr>
-            <w:noProof/>
-            <w:webHidden/>
-          </w:rPr>
-          <w:fldChar w:fldCharType="separate"/>
-        </w:r>
-        <w:r>
-          <w:rPr>
-            <w:noProof/>
-            <w:webHidden/>
-          </w:rPr>
-          <w:t>6</w:t>
-        </w:r>
-        <w:r>
-          <w:rPr>
-            <w:noProof/>
-            <w:webHidden/>
-          </w:rPr>
-          <w:fldChar w:fldCharType="end"/>
-        </w:r>
-      </w:hyperlink>
-    </w:p>
-    <w:p>
-      <w:pPr>
-        <w:pStyle w:val="TM1"/>
-        <w:tabs>
-          <w:tab w:val="right" w:leader="dot" w:pos="9402"/>
-        </w:tabs>
-        <w:rPr>
-          <w:noProof/>
-        </w:rPr>
-      </w:pPr>
-      <w:hyperlink w:anchor="_Toc244123712" w:history="1">
-        <w:r>
-          <w:rPr>
-            <w:rStyle w:val="Lienhypertexte"/>
-            <w:noProof/>
-          </w:rPr>
-          <w:t>10. Where to change what after the freeze</w:t>
-        </w:r>
-        <w:r>
-          <w:rPr>
-            <w:noProof/>
-            <w:webHidden/>
-          </w:rPr>
-          <w:tab/>
-        </w:r>
-        <w:r>
-          <w:rPr>
-            <w:noProof/>
-            <w:webHidden/>
-          </w:rPr>
-          <w:fldChar w:fldCharType="begin"/>
-        </w:r>
-        <w:r>
-          <w:rPr>
-            <w:noProof/>
-            <w:webHidden/>
-          </w:rPr>
-          <w:instrText xml:space="preserve"> PAGEREF _Toc244123712 \h </w:instrText>
+          <w:instrText xml:space="preserve"> PAGEREF _Toc244124678 \h </w:instrText>
         </w:r>
         <w:r>
           <w:rPr>
@@ -825,7 +621,211 @@
           <w:noProof/>
         </w:rPr>
       </w:pPr>
-      <w:hyperlink w:anchor="_Toc244123713" w:history="1">
+      <w:hyperlink w:anchor="_Toc244124679" w:history="1">
+        <w:r>
+          <w:rPr>
+            <w:rStyle w:val="Lienhypertexte"/>
+            <w:noProof/>
+          </w:rPr>
+          <w:t>8. Stale states</w:t>
+        </w:r>
+        <w:r>
+          <w:rPr>
+            <w:noProof/>
+            <w:webHidden/>
+          </w:rPr>
+          <w:tab/>
+        </w:r>
+        <w:r>
+          <w:rPr>
+            <w:noProof/>
+            <w:webHidden/>
+          </w:rPr>
+          <w:fldChar w:fldCharType="begin"/>
+        </w:r>
+        <w:r>
+          <w:rPr>
+            <w:noProof/>
+            <w:webHidden/>
+          </w:rPr>
+          <w:instrText xml:space="preserve"> PAGEREF _Toc244124679 \h </w:instrText>
+        </w:r>
+        <w:r>
+          <w:rPr>
+            <w:noProof/>
+            <w:webHidden/>
+          </w:rPr>
+        </w:r>
+        <w:r>
+          <w:rPr>
+            <w:noProof/>
+            <w:webHidden/>
+          </w:rPr>
+          <w:fldChar w:fldCharType="separate"/>
+        </w:r>
+        <w:r>
+          <w:rPr>
+            <w:noProof/>
+            <w:webHidden/>
+          </w:rPr>
+          <w:t>7</w:t>
+        </w:r>
+        <w:r>
+          <w:rPr>
+            <w:noProof/>
+            <w:webHidden/>
+          </w:rPr>
+          <w:fldChar w:fldCharType="end"/>
+        </w:r>
+      </w:hyperlink>
+    </w:p>
+    <w:p>
+      <w:pPr>
+        <w:pStyle w:val="TM1"/>
+        <w:tabs>
+          <w:tab w:val="right" w:leader="dot" w:pos="9402"/>
+        </w:tabs>
+        <w:rPr>
+          <w:noProof/>
+        </w:rPr>
+      </w:pPr>
+      <w:hyperlink w:anchor="_Toc244124680" w:history="1">
+        <w:r>
+          <w:rPr>
+            <w:rStyle w:val="Lienhypertexte"/>
+            <w:noProof/>
+          </w:rPr>
+          <w:t>9. Error handling</w:t>
+        </w:r>
+        <w:r>
+          <w:rPr>
+            <w:noProof/>
+            <w:webHidden/>
+          </w:rPr>
+          <w:tab/>
+        </w:r>
+        <w:r>
+          <w:rPr>
+            <w:noProof/>
+            <w:webHidden/>
+          </w:rPr>
+          <w:fldChar w:fldCharType="begin"/>
+        </w:r>
+        <w:r>
+          <w:rPr>
+            <w:noProof/>
+            <w:webHidden/>
+          </w:rPr>
+          <w:instrText xml:space="preserve"> PAGEREF _Toc244124680 \h </w:instrText>
+        </w:r>
+        <w:r>
+          <w:rPr>
+            <w:noProof/>
+            <w:webHidden/>
+          </w:rPr>
+        </w:r>
+        <w:r>
+          <w:rPr>
+            <w:noProof/>
+            <w:webHidden/>
+          </w:rPr>
+          <w:fldChar w:fldCharType="separate"/>
+        </w:r>
+        <w:r>
+          <w:rPr>
+            <w:noProof/>
+            <w:webHidden/>
+          </w:rPr>
+          <w:t>7</w:t>
+        </w:r>
+        <w:r>
+          <w:rPr>
+            <w:noProof/>
+            <w:webHidden/>
+          </w:rPr>
+          <w:fldChar w:fldCharType="end"/>
+        </w:r>
+      </w:hyperlink>
+    </w:p>
+    <w:p>
+      <w:pPr>
+        <w:pStyle w:val="TM1"/>
+        <w:tabs>
+          <w:tab w:val="right" w:leader="dot" w:pos="9402"/>
+        </w:tabs>
+        <w:rPr>
+          <w:noProof/>
+        </w:rPr>
+      </w:pPr>
+      <w:hyperlink w:anchor="_Toc244124681" w:history="1">
+        <w:r>
+          <w:rPr>
+            <w:rStyle w:val="Lienhypertexte"/>
+            <w:noProof/>
+          </w:rPr>
+          <w:t>10. Where to change what after the freeze</w:t>
+        </w:r>
+        <w:r>
+          <w:rPr>
+            <w:noProof/>
+            <w:webHidden/>
+          </w:rPr>
+          <w:tab/>
+        </w:r>
+        <w:r>
+          <w:rPr>
+            <w:noProof/>
+            <w:webHidden/>
+          </w:rPr>
+          <w:fldChar w:fldCharType="begin"/>
+        </w:r>
+        <w:r>
+          <w:rPr>
+            <w:noProof/>
+            <w:webHidden/>
+          </w:rPr>
+          <w:instrText xml:space="preserve"> PAGEREF _Toc244124681 \h </w:instrText>
+        </w:r>
+        <w:r>
+          <w:rPr>
+            <w:noProof/>
+            <w:webHidden/>
+          </w:rPr>
+        </w:r>
+        <w:r>
+          <w:rPr>
+            <w:noProof/>
+            <w:webHidden/>
+          </w:rPr>
+          <w:fldChar w:fldCharType="separate"/>
+        </w:r>
+        <w:r>
+          <w:rPr>
+            <w:noProof/>
+            <w:webHidden/>
+          </w:rPr>
+          <w:t>8</w:t>
+        </w:r>
+        <w:r>
+          <w:rPr>
+            <w:noProof/>
+            <w:webHidden/>
+          </w:rPr>
+          <w:fldChar w:fldCharType="end"/>
+        </w:r>
+      </w:hyperlink>
+    </w:p>
+    <w:p>
+      <w:pPr>
+        <w:pStyle w:val="TM1"/>
+        <w:tabs>
+          <w:tab w:val="right" w:leader="dot" w:pos="9402"/>
+        </w:tabs>
+        <w:rPr>
+          <w:noProof/>
+        </w:rPr>
+      </w:pPr>
+      <w:hyperlink w:anchor="_Toc244124682" w:history="1">
         <w:r>
           <w:rPr>
             <w:rStyle w:val="Lienhypertexte"/>
@@ -852,7 +852,7 @@
             <w:noProof/>
             <w:webHidden/>
           </w:rPr>
-          <w:instrText xml:space="preserve"> PAGEREF _Toc244123713 \h </w:instrText>
+          <w:instrText xml:space="preserve"> PAGEREF _Toc244124682 \h </w:instrText>
         </w:r>
         <w:r>
           <w:rPr>
@@ -872,7 +872,7 @@
             <w:noProof/>
             <w:webHidden/>
           </w:rPr>
-          <w:t>7</w:t>
+          <w:t>8</w:t>
         </w:r>
         <w:r>
           <w:rPr>
@@ -912,7 +912,7 @@
       <w:pPr>
         <w:pStyle w:val="Titre1"/>
       </w:pPr>
-      <w:bookmarkStart w:id="0" w:name="_Toc244123703"/>
+      <w:bookmarkStart w:id="0" w:name="_Toc244124672"/>
       <w:r>
         <w:t>1. The journey of one sentence</w:t>
       </w:r>
@@ -1165,11 +1165,133 @@
     </w:p>
     <w:p>
       <w:pPr>
+        <w:keepNext/>
+        <w:spacing w:before="120"/>
+        <w:jc w:val="center"/>
+      </w:pPr>
+      <w:r>
+        <w:rPr>
+          <w:noProof/>
+        </w:rPr>
+        <w:lastRenderedPageBreak/>
+        <w:drawing>
+          <wp:inline distT="0" distB="0" distL="0" distR="0" wp14:anchorId="57F2A96B" wp14:editId="135A57F9">
+            <wp:extent cx="3780000" cy="2149522"/>
+            <wp:effectExtent l="0" t="0" r="0" b="0"/>
+            <wp:docPr id="2" name="Picture 2" descr="Figure 1. Review step on the fictitious sample case: every value carries a colour and a written type."/>
+            <wp:cNvGraphicFramePr>
+              <a:graphicFrameLocks xmlns:a="http://schemas.openxmlformats.org/drawingml/2006/main" noChangeAspect="1"/>
+            </wp:cNvGraphicFramePr>
+            <a:graphic xmlns:a="http://schemas.openxmlformats.org/drawingml/2006/main">
+              <a:graphicData uri="http://schemas.openxmlformats.org/drawingml/2006/picture">
+                <pic:pic xmlns:pic="http://schemas.openxmlformats.org/drawingml/2006/picture">
+                  <pic:nvPicPr>
+                    <pic:cNvPr id="0" name="crop_02_review_highlight.png"/>
+                    <pic:cNvPicPr/>
+                  </pic:nvPicPr>
+                  <pic:blipFill>
+                    <a:blip r:embed="rId9"/>
+                    <a:stretch>
+                      <a:fillRect/>
+                    </a:stretch>
+                  </pic:blipFill>
+                  <pic:spPr>
+                    <a:xfrm>
+                      <a:off x="0" y="0"/>
+                      <a:ext cx="3780000" cy="2149522"/>
+                    </a:xfrm>
+                    <a:prstGeom prst="rect">
+                      <a:avLst/>
+                    </a:prstGeom>
+                  </pic:spPr>
+                </pic:pic>
+              </a:graphicData>
+            </a:graphic>
+          </wp:inline>
+        </w:drawing>
+      </w:r>
+    </w:p>
+    <w:p>
+      <w:pPr>
+        <w:spacing w:after="240"/>
+        <w:jc w:val="center"/>
+      </w:pPr>
+      <w:r>
+        <w:rPr>
+          <w:i/>
+          <w:color w:val="5B6675"/>
+          <w:sz w:val="19"/>
+        </w:rPr>
+        <w:t>Figure 1. Review step on the fictitious sample case: every value carries a colour and a written type.</w:t>
+      </w:r>
+    </w:p>
+    <w:p>
+      <w:pPr>
+        <w:keepNext/>
+        <w:spacing w:before="120"/>
+        <w:jc w:val="center"/>
+      </w:pPr>
+      <w:r>
+        <w:rPr>
+          <w:noProof/>
+        </w:rPr>
+        <w:drawing>
+          <wp:inline distT="0" distB="0" distL="0" distR="0" wp14:anchorId="0BEDA6BB" wp14:editId="3721FB0C">
+            <wp:extent cx="4140000" cy="1720741"/>
+            <wp:effectExtent l="0" t="0" r="0" b="0"/>
+            <wp:docPr id="3" name="Picture 3" descr="Figure 2. Final check: a surname left in the instruction raises an alert; nothing is masked automatically."/>
+            <wp:cNvGraphicFramePr>
+              <a:graphicFrameLocks xmlns:a="http://schemas.openxmlformats.org/drawingml/2006/main" noChangeAspect="1"/>
+            </wp:cNvGraphicFramePr>
+            <a:graphic xmlns:a="http://schemas.openxmlformats.org/drawingml/2006/main">
+              <a:graphicData uri="http://schemas.openxmlformats.org/drawingml/2006/picture">
+                <pic:pic xmlns:pic="http://schemas.openxmlformats.org/drawingml/2006/picture">
+                  <pic:nvPicPr>
+                    <pic:cNvPr id="0" name="crop_07_final_check.png"/>
+                    <pic:cNvPicPr/>
+                  </pic:nvPicPr>
+                  <pic:blipFill>
+                    <a:blip r:embed="rId10"/>
+                    <a:stretch>
+                      <a:fillRect/>
+                    </a:stretch>
+                  </pic:blipFill>
+                  <pic:spPr>
+                    <a:xfrm>
+                      <a:off x="0" y="0"/>
+                      <a:ext cx="4140000" cy="1720741"/>
+                    </a:xfrm>
+                    <a:prstGeom prst="rect">
+                      <a:avLst/>
+                    </a:prstGeom>
+                  </pic:spPr>
+                </pic:pic>
+              </a:graphicData>
+            </a:graphic>
+          </wp:inline>
+        </w:drawing>
+      </w:r>
+    </w:p>
+    <w:p>
+      <w:pPr>
+        <w:spacing w:after="240"/>
+        <w:jc w:val="center"/>
+      </w:pPr>
+      <w:r>
+        <w:rPr>
+          <w:i/>
+          <w:color w:val="5B6675"/>
+          <w:sz w:val="19"/>
+        </w:rPr>
+        <w:t>Figure 2. Final check: a surname left in the instruction raises an alert; nothing is masked automatically.</w:t>
+      </w:r>
+    </w:p>
+    <w:p>
+      <w:pPr>
         <w:pStyle w:val="Titre1"/>
       </w:pPr>
-      <w:bookmarkStart w:id="1" w:name="_Toc244123704"/>
+      <w:bookmarkStart w:id="1" w:name="_Toc244124673"/>
       <w:r>
-        <w:lastRenderedPageBreak/>
         <w:t>2. Overview diagram</w:t>
       </w:r>
       <w:bookmarkEnd w:id="1"/>
@@ -1185,10 +1307,10 @@
           <w:noProof/>
         </w:rPr>
         <w:drawing>
-          <wp:inline distT="0" distB="0" distL="0" distR="0" wp14:anchorId="13AD2287" wp14:editId="74124150">
+          <wp:inline distT="0" distB="0" distL="0" distR="0" wp14:anchorId="2DA8CE28" wp14:editId="3FF9A35B">
             <wp:extent cx="5976000" cy="2464663"/>
             <wp:effectExtent l="0" t="0" r="0" b="0"/>
-            <wp:docPr id="2" name="Picture 2" descr="Figure 1. Overview: the local pipeline, the mapping table kept apart and the external AI tool."/>
+            <wp:docPr id="4" name="Picture 4" descr="Figure 3. Overview: the local pipeline, the mapping table kept apart and the external AI tool."/>
             <wp:cNvGraphicFramePr>
               <a:graphicFrameLocks xmlns:a="http://schemas.openxmlformats.org/drawingml/2006/main" noChangeAspect="1"/>
             </wp:cNvGraphicFramePr>
@@ -1200,7 +1322,7 @@
                     <pic:cNvPicPr/>
                   </pic:nvPicPr>
                   <pic:blipFill>
-                    <a:blip r:embed="rId9"/>
+                    <a:blip r:embed="rId11"/>
                     <a:stretch>
                       <a:fillRect/>
                     </a:stretch>
@@ -1232,15 +1354,16 @@
           <w:color w:val="5B6675"/>
           <w:sz w:val="19"/>
         </w:rPr>
-        <w:t>Figure 1. Overview: the local pipeline, the mapping table kept apart and the external AI tool.</w:t>
+        <w:t>Figure 3. Overview: the local pipeline, the mapping table kept apart and the external AI tool.</w:t>
       </w:r>
     </w:p>
     <w:p>
       <w:pPr>
         <w:pStyle w:val="Titre1"/>
       </w:pPr>
-      <w:bookmarkStart w:id="2" w:name="_Toc244123705"/>
+      <w:bookmarkStart w:id="2" w:name="_Toc244124674"/>
       <w:r>
+        <w:lastRenderedPageBreak/>
         <w:t>3. Boundaries: local, cloud demo, AI tool</w:t>
       </w:r>
       <w:bookmarkEnd w:id="2"/>
@@ -1267,6 +1390,7 @@
       </w:tblGrid>
       <w:tr>
         <w:trPr>
+          <w:cantSplit/>
           <w:tblHeader/>
           <w:jc w:val="center"/>
         </w:trPr>
@@ -1277,6 +1401,7 @@
           </w:tcPr>
           <w:p>
             <w:pPr>
+              <w:keepNext/>
               <w:spacing w:after="40" w:line="240" w:lineRule="auto"/>
             </w:pPr>
             <w:r>
@@ -1296,6 +1421,7 @@
           </w:tcPr>
           <w:p>
             <w:pPr>
+              <w:keepNext/>
               <w:spacing w:after="40" w:line="240" w:lineRule="auto"/>
             </w:pPr>
             <w:r>
@@ -1315,6 +1441,7 @@
           </w:tcPr>
           <w:p>
             <w:pPr>
+              <w:keepNext/>
               <w:spacing w:after="40" w:line="240" w:lineRule="auto"/>
             </w:pPr>
             <w:r>
@@ -1330,6 +1457,7 @@
       </w:tr>
       <w:tr>
         <w:trPr>
+          <w:cantSplit/>
           <w:jc w:val="center"/>
         </w:trPr>
         <w:tc>
@@ -1338,6 +1466,7 @@
           </w:tcPr>
           <w:p>
             <w:pPr>
+              <w:keepNext/>
               <w:spacing w:after="40" w:line="240" w:lineRule="auto"/>
             </w:pPr>
             <w:r>
@@ -1354,6 +1483,7 @@
           </w:tcPr>
           <w:p>
             <w:pPr>
+              <w:keepNext/>
               <w:spacing w:after="40" w:line="240" w:lineRule="auto"/>
             </w:pPr>
             <w:r>
@@ -1384,6 +1514,7 @@
           </w:tcPr>
           <w:p>
             <w:pPr>
+              <w:keepNext/>
               <w:spacing w:after="40" w:line="240" w:lineRule="auto"/>
             </w:pPr>
             <w:r>
@@ -1397,6 +1528,7 @@
       </w:tr>
       <w:tr>
         <w:trPr>
+          <w:cantSplit/>
           <w:jc w:val="center"/>
         </w:trPr>
         <w:tc>
@@ -1406,6 +1538,7 @@
           </w:tcPr>
           <w:p>
             <w:pPr>
+              <w:keepNext/>
               <w:spacing w:after="40" w:line="240" w:lineRule="auto"/>
             </w:pPr>
             <w:r>
@@ -1423,6 +1556,7 @@
           </w:tcPr>
           <w:p>
             <w:pPr>
+              <w:keepNext/>
               <w:spacing w:after="40" w:line="240" w:lineRule="auto"/>
             </w:pPr>
             <w:r>
@@ -1440,6 +1574,7 @@
           </w:tcPr>
           <w:p>
             <w:pPr>
+              <w:keepNext/>
               <w:spacing w:after="40" w:line="240" w:lineRule="auto"/>
             </w:pPr>
             <w:r>
@@ -1453,6 +1588,7 @@
       </w:tr>
       <w:tr>
         <w:trPr>
+          <w:cantSplit/>
           <w:jc w:val="center"/>
         </w:trPr>
         <w:tc>
@@ -1521,10 +1657,10 @@
           <w:noProof/>
         </w:rPr>
         <w:drawing>
-          <wp:inline distT="0" distB="0" distL="0" distR="0" wp14:anchorId="7B60986D" wp14:editId="43C487A8">
+          <wp:inline distT="0" distB="0" distL="0" distR="0" wp14:anchorId="66FCB731" wp14:editId="080CCA8A">
             <wp:extent cx="5976000" cy="2198285"/>
             <wp:effectExtent l="0" t="0" r="0" b="0"/>
-            <wp:docPr id="3" name="Picture 3" descr="Figure 2. Boundaries: what runs locally, what the public demo receives and what the external AI tool receives."/>
+            <wp:docPr id="5" name="Picture 5" descr="Figure 4. Boundaries: what runs locally, what the public demo receives and what the external AI tool receives."/>
             <wp:cNvGraphicFramePr>
               <a:graphicFrameLocks xmlns:a="http://schemas.openxmlformats.org/drawingml/2006/main" noChangeAspect="1"/>
             </wp:cNvGraphicFramePr>
@@ -1536,7 +1672,7 @@
                     <pic:cNvPicPr/>
                   </pic:nvPicPr>
                   <pic:blipFill>
-                    <a:blip r:embed="rId10"/>
+                    <a:blip r:embed="rId12"/>
                     <a:stretch>
                       <a:fillRect/>
                     </a:stretch>
@@ -1568,7 +1704,7 @@
           <w:color w:val="5B6675"/>
           <w:sz w:val="19"/>
         </w:rPr>
-        <w:t>Figure 2. Boundaries: what runs locally, what the public demo receives and what the external AI tool receives.</w:t>
+        <w:t>Figure 4. Boundaries: what runs locally, what the public demo receives and what the external AI tool receives.</w:t>
       </w:r>
     </w:p>
     <w:p>
@@ -1580,9 +1716,8 @@
       <w:pPr>
         <w:pStyle w:val="Titre1"/>
       </w:pPr>
-      <w:bookmarkStart w:id="3" w:name="_Toc244123706"/>
+      <w:bookmarkStart w:id="3" w:name="_Toc244124675"/>
       <w:r>
-        <w:lastRenderedPageBreak/>
         <w:t>4. The mapping table, kept apart</w:t>
       </w:r>
       <w:bookmarkEnd w:id="3"/>
@@ -1666,8 +1801,9 @@
       <w:pPr>
         <w:pStyle w:val="Titre1"/>
       </w:pPr>
-      <w:bookmarkStart w:id="4" w:name="_Toc244123707"/>
+      <w:bookmarkStart w:id="4" w:name="_Toc244124676"/>
       <w:r>
+        <w:lastRenderedPageBreak/>
         <w:t>5. Module families</w:t>
       </w:r>
       <w:bookmarkEnd w:id="4"/>
@@ -1695,6 +1831,7 @@
       </w:tblGrid>
       <w:tr>
         <w:trPr>
+          <w:cantSplit/>
           <w:tblHeader/>
           <w:jc w:val="center"/>
         </w:trPr>
@@ -1705,6 +1842,7 @@
           </w:tcPr>
           <w:p>
             <w:pPr>
+              <w:keepNext/>
               <w:spacing w:after="40" w:line="240" w:lineRule="auto"/>
             </w:pPr>
             <w:r>
@@ -1724,6 +1862,7 @@
           </w:tcPr>
           <w:p>
             <w:pPr>
+              <w:keepNext/>
               <w:spacing w:after="40" w:line="240" w:lineRule="auto"/>
             </w:pPr>
             <w:r>
@@ -1743,6 +1882,7 @@
           </w:tcPr>
           <w:p>
             <w:pPr>
+              <w:keepNext/>
               <w:spacing w:after="40" w:line="240" w:lineRule="auto"/>
             </w:pPr>
             <w:r>
@@ -1762,6 +1902,7 @@
           </w:tcPr>
           <w:p>
             <w:pPr>
+              <w:keepNext/>
               <w:spacing w:after="40" w:line="240" w:lineRule="auto"/>
             </w:pPr>
             <w:r>
@@ -1777,6 +1918,1543 @@
       </w:tr>
       <w:tr>
         <w:trPr>
+          <w:cantSplit/>
+          <w:jc w:val="center"/>
+        </w:trPr>
+        <w:tc>
+          <w:tcPr>
+            <w:tcW w:w="2069" w:type="dxa"/>
+          </w:tcPr>
+          <w:p>
+            <w:pPr>
+              <w:keepNext/>
+              <w:spacing w:after="40" w:line="240" w:lineRule="auto"/>
+            </w:pPr>
+            <w:r>
+              <w:rPr>
+                <w:sz w:val="19"/>
+              </w:rPr>
+              <w:t>Entry point</w:t>
+            </w:r>
+          </w:p>
+        </w:tc>
+        <w:tc>
+          <w:tcPr>
+            <w:tcW w:w="4224" w:type="dxa"/>
+          </w:tcPr>
+          <w:p>
+            <w:pPr>
+              <w:keepNext/>
+              <w:spacing w:after="40" w:line="240" w:lineRule="auto"/>
+            </w:pPr>
+            <w:r>
+              <w:rPr>
+                <w:rFonts w:ascii="Consolas" w:hAnsi="Consolas"/>
+                <w:color w:val="1F3A5F"/>
+                <w:sz w:val="17"/>
+              </w:rPr>
+              <w:t>streamlit_app.py</w:t>
+            </w:r>
+          </w:p>
+        </w:tc>
+        <w:tc>
+          <w:tcPr>
+            <w:tcW w:w="1843" w:type="dxa"/>
+          </w:tcPr>
+          <w:p>
+            <w:pPr>
+              <w:keepNext/>
+              <w:spacing w:after="40" w:line="240" w:lineRule="auto"/>
+            </w:pPr>
+            <w:r>
+              <w:rPr>
+                <w:sz w:val="19"/>
+              </w:rPr>
+              <w:t>Browser request</w:t>
+            </w:r>
+          </w:p>
+        </w:tc>
+        <w:tc>
+          <w:tcPr>
+            <w:tcW w:w="2069" w:type="dxa"/>
+          </w:tcPr>
+          <w:p>
+            <w:pPr>
+              <w:keepNext/>
+              <w:spacing w:after="40" w:line="240" w:lineRule="auto"/>
+            </w:pPr>
+            <w:r>
+              <w:rPr>
+                <w:sz w:val="19"/>
+              </w:rPr>
+              <w:t>Pages Pseudonymize, Method &amp; limits, Evaluation (hidden)</w:t>
+            </w:r>
+          </w:p>
+        </w:tc>
+      </w:tr>
+      <w:tr>
+        <w:trPr>
+          <w:cantSplit/>
+          <w:jc w:val="center"/>
+        </w:trPr>
+        <w:tc>
+          <w:tcPr>
+            <w:tcW w:w="2069" w:type="dxa"/>
+            <w:shd w:val="clear" w:color="auto" w:fill="F6F7F9"/>
+          </w:tcPr>
+          <w:p>
+            <w:pPr>
+              <w:keepNext/>
+              <w:spacing w:after="40" w:line="240" w:lineRule="auto"/>
+            </w:pPr>
+            <w:r>
+              <w:rPr>
+                <w:sz w:val="19"/>
+              </w:rPr>
+              <w:t>Interface</w:t>
+            </w:r>
+          </w:p>
+        </w:tc>
+        <w:tc>
+          <w:tcPr>
+            <w:tcW w:w="4224" w:type="dxa"/>
+            <w:shd w:val="clear" w:color="auto" w:fill="F6F7F9"/>
+          </w:tcPr>
+          <w:p>
+            <w:pPr>
+              <w:keepNext/>
+              <w:spacing w:after="40" w:line="240" w:lineRule="auto"/>
+            </w:pPr>
+            <w:r>
+              <w:rPr>
+                <w:rFonts w:ascii="Consolas" w:hAnsi="Consolas"/>
+                <w:color w:val="1F3A5F"/>
+                <w:sz w:val="17"/>
+              </w:rPr>
+              <w:t>app/</w:t>
+            </w:r>
+            <w:r>
+              <w:rPr>
+                <w:sz w:val="19"/>
+              </w:rPr>
+              <w:t xml:space="preserve"> (</w:t>
+            </w:r>
+            <w:r>
+              <w:rPr>
+                <w:rFonts w:ascii="Consolas" w:hAnsi="Consolas"/>
+                <w:color w:val="1F3A5F"/>
+                <w:sz w:val="17"/>
+              </w:rPr>
+              <w:t>state.py</w:t>
+            </w:r>
+            <w:r>
+              <w:rPr>
+                <w:sz w:val="19"/>
+              </w:rPr>
+              <w:t xml:space="preserve">, </w:t>
+            </w:r>
+            <w:r>
+              <w:rPr>
+                <w:rFonts w:ascii="Consolas" w:hAnsi="Consolas"/>
+                <w:color w:val="1F3A5F"/>
+                <w:sz w:val="17"/>
+              </w:rPr>
+              <w:t>sidebar.py</w:t>
+            </w:r>
+            <w:r>
+              <w:rPr>
+                <w:sz w:val="19"/>
+              </w:rPr>
+              <w:t xml:space="preserve">, </w:t>
+            </w:r>
+            <w:r>
+              <w:rPr>
+                <w:rFonts w:ascii="Consolas" w:hAnsi="Consolas"/>
+                <w:color w:val="1F3A5F"/>
+                <w:sz w:val="17"/>
+              </w:rPr>
+              <w:t>engine.py</w:t>
+            </w:r>
+            <w:r>
+              <w:rPr>
+                <w:sz w:val="19"/>
+              </w:rPr>
+              <w:t xml:space="preserve">, </w:t>
+            </w:r>
+            <w:r>
+              <w:rPr>
+                <w:rFonts w:ascii="Consolas" w:hAnsi="Consolas"/>
+                <w:color w:val="1F3A5F"/>
+                <w:sz w:val="17"/>
+              </w:rPr>
+              <w:t>fingerprints.py</w:t>
+            </w:r>
+            <w:r>
+              <w:rPr>
+                <w:sz w:val="19"/>
+              </w:rPr>
+              <w:t xml:space="preserve">, </w:t>
+            </w:r>
+            <w:r>
+              <w:rPr>
+                <w:rFonts w:ascii="Consolas" w:hAnsi="Consolas"/>
+                <w:color w:val="1F3A5F"/>
+                <w:sz w:val="17"/>
+              </w:rPr>
+              <w:t>steps/</w:t>
+            </w:r>
+            <w:r>
+              <w:rPr>
+                <w:sz w:val="19"/>
+              </w:rPr>
+              <w:t xml:space="preserve">, </w:t>
+            </w:r>
+            <w:r>
+              <w:rPr>
+                <w:rFonts w:ascii="Consolas" w:hAnsi="Consolas"/>
+                <w:color w:val="1F3A5F"/>
+                <w:sz w:val="17"/>
+              </w:rPr>
+              <w:t>components/</w:t>
+            </w:r>
+            <w:r>
+              <w:rPr>
+                <w:sz w:val="19"/>
+              </w:rPr>
+              <w:t xml:space="preserve">, </w:t>
+            </w:r>
+            <w:r>
+              <w:rPr>
+                <w:rFonts w:ascii="Consolas" w:hAnsi="Consolas"/>
+                <w:color w:val="1F3A5F"/>
+                <w:sz w:val="17"/>
+              </w:rPr>
+              <w:t>pages/</w:t>
+            </w:r>
+            <w:r>
+              <w:rPr>
+                <w:sz w:val="19"/>
+              </w:rPr>
+              <w:t xml:space="preserve">, </w:t>
+            </w:r>
+            <w:r>
+              <w:rPr>
+                <w:rFonts w:ascii="Consolas" w:hAnsi="Consolas"/>
+                <w:color w:val="1F3A5F"/>
+                <w:sz w:val="17"/>
+              </w:rPr>
+              <w:t>i18n/</w:t>
+            </w:r>
+            <w:r>
+              <w:rPr>
+                <w:sz w:val="19"/>
+              </w:rPr>
+              <w:t xml:space="preserve">, </w:t>
+            </w:r>
+            <w:r>
+              <w:rPr>
+                <w:rFonts w:ascii="Consolas" w:hAnsi="Consolas"/>
+                <w:color w:val="1F3A5F"/>
+                <w:sz w:val="17"/>
+              </w:rPr>
+              <w:t>assets/style.css</w:t>
+            </w:r>
+            <w:r>
+              <w:rPr>
+                <w:sz w:val="19"/>
+              </w:rPr>
+              <w:t>)</w:t>
+            </w:r>
+          </w:p>
+        </w:tc>
+        <w:tc>
+          <w:tcPr>
+            <w:tcW w:w="1843" w:type="dxa"/>
+            <w:shd w:val="clear" w:color="auto" w:fill="F6F7F9"/>
+          </w:tcPr>
+          <w:p>
+            <w:pPr>
+              <w:keepNext/>
+              <w:spacing w:after="40" w:line="240" w:lineRule="auto"/>
+            </w:pPr>
+            <w:r>
+              <w:rPr>
+                <w:sz w:val="19"/>
+              </w:rPr>
+              <w:t>User actions</w:t>
+            </w:r>
+          </w:p>
+        </w:tc>
+        <w:tc>
+          <w:tcPr>
+            <w:tcW w:w="2069" w:type="dxa"/>
+            <w:shd w:val="clear" w:color="auto" w:fill="F6F7F9"/>
+          </w:tcPr>
+          <w:p>
+            <w:pPr>
+              <w:keepNext/>
+              <w:spacing w:after="40" w:line="240" w:lineRule="auto"/>
+            </w:pPr>
+            <w:r>
+              <w:rPr>
+                <w:sz w:val="19"/>
+              </w:rPr>
+              <w:t>Screens, session state, messages in English or French</w:t>
+            </w:r>
+          </w:p>
+        </w:tc>
+      </w:tr>
+      <w:tr>
+        <w:trPr>
+          <w:cantSplit/>
+          <w:jc w:val="center"/>
+        </w:trPr>
+        <w:tc>
+          <w:tcPr>
+            <w:tcW w:w="2069" w:type="dxa"/>
+          </w:tcPr>
+          <w:p>
+            <w:pPr>
+              <w:keepNext/>
+              <w:spacing w:after="40" w:line="240" w:lineRule="auto"/>
+            </w:pPr>
+            <w:r>
+              <w:rPr>
+                <w:sz w:val="19"/>
+              </w:rPr>
+              <w:t>Shared contract</w:t>
+            </w:r>
+          </w:p>
+        </w:tc>
+        <w:tc>
+          <w:tcPr>
+            <w:tcW w:w="4224" w:type="dxa"/>
+          </w:tcPr>
+          <w:p>
+            <w:pPr>
+              <w:keepNext/>
+              <w:spacing w:after="40" w:line="240" w:lineRule="auto"/>
+            </w:pPr>
+            <w:r>
+              <w:rPr>
+                <w:rFonts w:ascii="Consolas" w:hAnsi="Consolas"/>
+                <w:color w:val="1F3A5F"/>
+                <w:sz w:val="17"/>
+              </w:rPr>
+              <w:t>src/huisclos/models.py</w:t>
+            </w:r>
+            <w:r>
+              <w:rPr>
+                <w:sz w:val="19"/>
+              </w:rPr>
+              <w:t xml:space="preserve">, </w:t>
+            </w:r>
+            <w:r>
+              <w:rPr>
+                <w:rFonts w:ascii="Consolas" w:hAnsi="Consolas"/>
+                <w:color w:val="1F3A5F"/>
+                <w:sz w:val="17"/>
+              </w:rPr>
+              <w:t>config.py</w:t>
+            </w:r>
+            <w:r>
+              <w:rPr>
+                <w:sz w:val="19"/>
+              </w:rPr>
+              <w:t xml:space="preserve">, </w:t>
+            </w:r>
+            <w:r>
+              <w:rPr>
+                <w:rFonts w:ascii="Consolas" w:hAnsi="Consolas"/>
+                <w:color w:val="1F3A5F"/>
+                <w:sz w:val="17"/>
+              </w:rPr>
+              <w:t>text_utils.py</w:t>
+            </w:r>
+          </w:p>
+        </w:tc>
+        <w:tc>
+          <w:tcPr>
+            <w:tcW w:w="1843" w:type="dxa"/>
+          </w:tcPr>
+          <w:p>
+            <w:pPr>
+              <w:keepNext/>
+              <w:spacing w:after="40" w:line="240" w:lineRule="auto"/>
+            </w:pPr>
+            <w:r>
+              <w:rPr>
+                <w:sz w:val="19"/>
+              </w:rPr>
+              <w:t>None</w:t>
+            </w:r>
+          </w:p>
+        </w:tc>
+        <w:tc>
+          <w:tcPr>
+            <w:tcW w:w="2069" w:type="dxa"/>
+          </w:tcPr>
+          <w:p>
+            <w:pPr>
+              <w:keepNext/>
+              <w:spacing w:after="40" w:line="240" w:lineRule="auto"/>
+            </w:pPr>
+            <w:r>
+              <w:rPr>
+                <w:sz w:val="19"/>
+              </w:rPr>
+              <w:t xml:space="preserve">Entity types, sources, </w:t>
+            </w:r>
+            <w:r>
+              <w:rPr>
+                <w:rFonts w:ascii="Consolas" w:hAnsi="Consolas"/>
+                <w:color w:val="1F3A5F"/>
+                <w:sz w:val="17"/>
+              </w:rPr>
+              <w:t>Detection</w:t>
+            </w:r>
+            <w:r>
+              <w:rPr>
+                <w:sz w:val="19"/>
+              </w:rPr>
+              <w:t xml:space="preserve">, token style, </w:t>
+            </w:r>
+            <w:r>
+              <w:rPr>
+                <w:rFonts w:ascii="Consolas" w:hAnsi="Consolas"/>
+                <w:color w:val="1F3A5F"/>
+                <w:sz w:val="17"/>
+              </w:rPr>
+              <w:t>DetectionConfig</w:t>
+            </w:r>
+            <w:r>
+              <w:rPr>
+                <w:sz w:val="19"/>
+              </w:rPr>
+              <w:t>, profiles</w:t>
+            </w:r>
+          </w:p>
+        </w:tc>
+      </w:tr>
+      <w:tr>
+        <w:trPr>
+          <w:cantSplit/>
+          <w:jc w:val="center"/>
+        </w:trPr>
+        <w:tc>
+          <w:tcPr>
+            <w:tcW w:w="2069" w:type="dxa"/>
+            <w:shd w:val="clear" w:color="auto" w:fill="F6F7F9"/>
+          </w:tcPr>
+          <w:p>
+            <w:pPr>
+              <w:keepNext/>
+              <w:spacing w:after="40" w:line="240" w:lineRule="auto"/>
+            </w:pPr>
+            <w:r>
+              <w:rPr>
+                <w:sz w:val="19"/>
+              </w:rPr>
+              <w:t>Reading and writing</w:t>
+            </w:r>
+          </w:p>
+        </w:tc>
+        <w:tc>
+          <w:tcPr>
+            <w:tcW w:w="4224" w:type="dxa"/>
+            <w:shd w:val="clear" w:color="auto" w:fill="F6F7F9"/>
+          </w:tcPr>
+          <w:p>
+            <w:pPr>
+              <w:keepNext/>
+              <w:spacing w:after="40" w:line="240" w:lineRule="auto"/>
+            </w:pPr>
+            <w:r>
+              <w:rPr>
+                <w:rFonts w:ascii="Consolas" w:hAnsi="Consolas"/>
+                <w:color w:val="1F3A5F"/>
+                <w:sz w:val="17"/>
+              </w:rPr>
+              <w:t>src/huisclos/io/</w:t>
+            </w:r>
+            <w:r>
+              <w:rPr>
+                <w:sz w:val="19"/>
+              </w:rPr>
+              <w:t xml:space="preserve"> (</w:t>
+            </w:r>
+            <w:r>
+              <w:rPr>
+                <w:rFonts w:ascii="Consolas" w:hAnsi="Consolas"/>
+                <w:color w:val="1F3A5F"/>
+                <w:sz w:val="17"/>
+              </w:rPr>
+              <w:t>readers.py</w:t>
+            </w:r>
+            <w:r>
+              <w:rPr>
+                <w:sz w:val="19"/>
+              </w:rPr>
+              <w:t xml:space="preserve">, </w:t>
+            </w:r>
+            <w:r>
+              <w:rPr>
+                <w:rFonts w:ascii="Consolas" w:hAnsi="Consolas"/>
+                <w:color w:val="1F3A5F"/>
+                <w:sz w:val="17"/>
+              </w:rPr>
+              <w:t>read_quality.py</w:t>
+            </w:r>
+            <w:r>
+              <w:rPr>
+                <w:sz w:val="19"/>
+              </w:rPr>
+              <w:t xml:space="preserve">, </w:t>
+            </w:r>
+            <w:r>
+              <w:rPr>
+                <w:rFonts w:ascii="Consolas" w:hAnsi="Consolas"/>
+                <w:color w:val="1F3A5F"/>
+                <w:sz w:val="17"/>
+              </w:rPr>
+              <w:t>writers.py</w:t>
+            </w:r>
+            <w:r>
+              <w:rPr>
+                <w:sz w:val="19"/>
+              </w:rPr>
+              <w:t>)</w:t>
+            </w:r>
+          </w:p>
+        </w:tc>
+        <w:tc>
+          <w:tcPr>
+            <w:tcW w:w="1843" w:type="dxa"/>
+            <w:shd w:val="clear" w:color="auto" w:fill="F6F7F9"/>
+          </w:tcPr>
+          <w:p>
+            <w:pPr>
+              <w:keepNext/>
+              <w:spacing w:after="40" w:line="240" w:lineRule="auto"/>
+            </w:pPr>
+            <w:r>
+              <w:rPr>
+                <w:sz w:val="19"/>
+              </w:rPr>
+              <w:t>File bytes or text</w:t>
+            </w:r>
+          </w:p>
+        </w:tc>
+        <w:tc>
+          <w:tcPr>
+            <w:tcW w:w="2069" w:type="dxa"/>
+            <w:shd w:val="clear" w:color="auto" w:fill="F6F7F9"/>
+          </w:tcPr>
+          <w:p>
+            <w:pPr>
+              <w:keepNext/>
+              <w:spacing w:after="40" w:line="240" w:lineRule="auto"/>
+            </w:pPr>
+            <w:r>
+              <w:rPr>
+                <w:sz w:val="19"/>
+              </w:rPr>
+              <w:t>Normalised text and quality note; .txt and .docx bytes</w:t>
+            </w:r>
+          </w:p>
+        </w:tc>
+      </w:tr>
+      <w:tr>
+        <w:trPr>
+          <w:cantSplit/>
+          <w:jc w:val="center"/>
+        </w:trPr>
+        <w:tc>
+          <w:tcPr>
+            <w:tcW w:w="2069" w:type="dxa"/>
+          </w:tcPr>
+          <w:p>
+            <w:pPr>
+              <w:keepNext/>
+              <w:spacing w:after="40" w:line="240" w:lineRule="auto"/>
+            </w:pPr>
+            <w:r>
+              <w:rPr>
+                <w:sz w:val="19"/>
+              </w:rPr>
+              <w:t>Rules</w:t>
+            </w:r>
+          </w:p>
+        </w:tc>
+        <w:tc>
+          <w:tcPr>
+            <w:tcW w:w="4224" w:type="dxa"/>
+          </w:tcPr>
+          <w:p>
+            <w:pPr>
+              <w:keepNext/>
+              <w:spacing w:after="40" w:line="240" w:lineRule="auto"/>
+            </w:pPr>
+            <w:r>
+              <w:rPr>
+                <w:rFonts w:ascii="Consolas" w:hAnsi="Consolas"/>
+                <w:color w:val="1F3A5F"/>
+                <w:sz w:val="17"/>
+              </w:rPr>
+              <w:t>detection/patterns.py</w:t>
+            </w:r>
+            <w:r>
+              <w:rPr>
+                <w:sz w:val="19"/>
+              </w:rPr>
+              <w:t xml:space="preserve">, </w:t>
+            </w:r>
+            <w:r>
+              <w:rPr>
+                <w:rFonts w:ascii="Consolas" w:hAnsi="Consolas"/>
+                <w:color w:val="1F3A5F"/>
+                <w:sz w:val="17"/>
+              </w:rPr>
+              <w:t>english_patterns.py</w:t>
+            </w:r>
+            <w:r>
+              <w:rPr>
+                <w:sz w:val="19"/>
+              </w:rPr>
+              <w:t xml:space="preserve">, </w:t>
+            </w:r>
+            <w:r>
+              <w:rPr>
+                <w:rFonts w:ascii="Consolas" w:hAnsi="Consolas"/>
+                <w:color w:val="1F3A5F"/>
+                <w:sz w:val="17"/>
+              </w:rPr>
+              <w:t>checksums.py</w:t>
+            </w:r>
+            <w:r>
+              <w:rPr>
+                <w:sz w:val="19"/>
+              </w:rPr>
+              <w:t xml:space="preserve">, </w:t>
+            </w:r>
+            <w:r>
+              <w:rPr>
+                <w:rFonts w:ascii="Consolas" w:hAnsi="Consolas"/>
+                <w:color w:val="1F3A5F"/>
+                <w:sz w:val="17"/>
+              </w:rPr>
+              <w:t>address_bounds.py</w:t>
+            </w:r>
+            <w:r>
+              <w:rPr>
+                <w:sz w:val="19"/>
+              </w:rPr>
+              <w:t xml:space="preserve">, </w:t>
+            </w:r>
+            <w:r>
+              <w:rPr>
+                <w:rFonts w:ascii="Consolas" w:hAnsi="Consolas"/>
+                <w:color w:val="1F3A5F"/>
+                <w:sz w:val="17"/>
+              </w:rPr>
+              <w:t>address_patterns.py</w:t>
+            </w:r>
+            <w:r>
+              <w:rPr>
+                <w:sz w:val="19"/>
+              </w:rPr>
+              <w:t xml:space="preserve">, </w:t>
+            </w:r>
+            <w:r>
+              <w:rPr>
+                <w:rFonts w:ascii="Consolas" w:hAnsi="Consolas"/>
+                <w:color w:val="1F3A5F"/>
+                <w:sz w:val="17"/>
+              </w:rPr>
+              <w:t>case_patterns.py</w:t>
+            </w:r>
+            <w:r>
+              <w:rPr>
+                <w:sz w:val="19"/>
+              </w:rPr>
+              <w:t xml:space="preserve">, </w:t>
+            </w:r>
+            <w:r>
+              <w:rPr>
+                <w:rFonts w:ascii="Consolas" w:hAnsi="Consolas"/>
+                <w:color w:val="1F3A5F"/>
+                <w:sz w:val="17"/>
+              </w:rPr>
+              <w:t>labeled_identifiers.py</w:t>
+            </w:r>
+            <w:r>
+              <w:rPr>
+                <w:sz w:val="19"/>
+              </w:rPr>
+              <w:t xml:space="preserve">, </w:t>
+            </w:r>
+            <w:r>
+              <w:rPr>
+                <w:rFonts w:ascii="Consolas" w:hAnsi="Consolas"/>
+                <w:color w:val="1F3A5F"/>
+                <w:sz w:val="17"/>
+              </w:rPr>
+              <w:t>person_heuristics.py</w:t>
+            </w:r>
+          </w:p>
+        </w:tc>
+        <w:tc>
+          <w:tcPr>
+            <w:tcW w:w="1843" w:type="dxa"/>
+          </w:tcPr>
+          <w:p>
+            <w:pPr>
+              <w:keepNext/>
+              <w:spacing w:after="40" w:line="240" w:lineRule="auto"/>
+            </w:pPr>
+            <w:r>
+              <w:rPr>
+                <w:sz w:val="19"/>
+              </w:rPr>
+              <w:t>Analysis view, document language</w:t>
+            </w:r>
+          </w:p>
+        </w:tc>
+        <w:tc>
+          <w:tcPr>
+            <w:tcW w:w="2069" w:type="dxa"/>
+          </w:tcPr>
+          <w:p>
+            <w:pPr>
+              <w:keepNext/>
+              <w:spacing w:after="40" w:line="240" w:lineRule="auto"/>
+            </w:pPr>
+            <w:r>
+              <w:rPr>
+                <w:sz w:val="19"/>
+              </w:rPr>
+              <w:t>Scored candidates</w:t>
+            </w:r>
+          </w:p>
+        </w:tc>
+      </w:tr>
+      <w:tr>
+        <w:trPr>
+          <w:cantSplit/>
+          <w:jc w:val="center"/>
+        </w:trPr>
+        <w:tc>
+          <w:tcPr>
+            <w:tcW w:w="2069" w:type="dxa"/>
+            <w:shd w:val="clear" w:color="auto" w:fill="F6F7F9"/>
+          </w:tcPr>
+          <w:p>
+            <w:pPr>
+              <w:keepNext/>
+              <w:spacing w:after="40" w:line="240" w:lineRule="auto"/>
+            </w:pPr>
+            <w:r>
+              <w:rPr>
+                <w:sz w:val="19"/>
+              </w:rPr>
+              <w:t>Statistical models</w:t>
+            </w:r>
+          </w:p>
+        </w:tc>
+        <w:tc>
+          <w:tcPr>
+            <w:tcW w:w="4224" w:type="dxa"/>
+            <w:shd w:val="clear" w:color="auto" w:fill="F6F7F9"/>
+          </w:tcPr>
+          <w:p>
+            <w:pPr>
+              <w:keepNext/>
+              <w:spacing w:after="40" w:line="240" w:lineRule="auto"/>
+            </w:pPr>
+            <w:r>
+              <w:rPr>
+                <w:rFonts w:ascii="Consolas" w:hAnsi="Consolas"/>
+                <w:color w:val="1F3A5F"/>
+                <w:sz w:val="17"/>
+              </w:rPr>
+              <w:t>detection/ner.py</w:t>
+            </w:r>
+            <w:r>
+              <w:rPr>
+                <w:sz w:val="19"/>
+              </w:rPr>
+              <w:t xml:space="preserve"> (spaCy), </w:t>
+            </w:r>
+            <w:r>
+              <w:rPr>
+                <w:rFonts w:ascii="Consolas" w:hAnsi="Consolas"/>
+                <w:color w:val="1F3A5F"/>
+                <w:sz w:val="17"/>
+              </w:rPr>
+              <w:t>camembert.py</w:t>
+            </w:r>
+            <w:r>
+              <w:rPr>
+                <w:sz w:val="19"/>
+              </w:rPr>
+              <w:t xml:space="preserve">, </w:t>
+            </w:r>
+            <w:r>
+              <w:rPr>
+                <w:rFonts w:ascii="Consolas" w:hAnsi="Consolas"/>
+                <w:color w:val="1F3A5F"/>
+                <w:sz w:val="17"/>
+              </w:rPr>
+              <w:t>gliner.py</w:t>
+            </w:r>
+            <w:r>
+              <w:rPr>
+                <w:sz w:val="19"/>
+              </w:rPr>
+              <w:t xml:space="preserve">, </w:t>
+            </w:r>
+            <w:r>
+              <w:rPr>
+                <w:rFonts w:ascii="Consolas" w:hAnsi="Consolas"/>
+                <w:color w:val="1F3A5F"/>
+                <w:sz w:val="17"/>
+              </w:rPr>
+              <w:t>windows.py</w:t>
+            </w:r>
+            <w:r>
+              <w:rPr>
+                <w:sz w:val="19"/>
+              </w:rPr>
+              <w:t xml:space="preserve">, </w:t>
+            </w:r>
+            <w:r>
+              <w:rPr>
+                <w:rFonts w:ascii="Consolas" w:hAnsi="Consolas"/>
+                <w:color w:val="1F3A5F"/>
+                <w:sz w:val="17"/>
+              </w:rPr>
+              <w:t>pii_labels.py</w:t>
+            </w:r>
+            <w:r>
+              <w:rPr>
+                <w:sz w:val="19"/>
+              </w:rPr>
+              <w:t xml:space="preserve">, </w:t>
+            </w:r>
+            <w:r>
+              <w:rPr>
+                <w:rFonts w:ascii="Consolas" w:hAnsi="Consolas"/>
+                <w:color w:val="1F3A5F"/>
+                <w:sz w:val="17"/>
+              </w:rPr>
+              <w:t>languages.py</w:t>
+            </w:r>
+          </w:p>
+        </w:tc>
+        <w:tc>
+          <w:tcPr>
+            <w:tcW w:w="1843" w:type="dxa"/>
+            <w:shd w:val="clear" w:color="auto" w:fill="F6F7F9"/>
+          </w:tcPr>
+          <w:p>
+            <w:pPr>
+              <w:keepNext/>
+              <w:spacing w:after="40" w:line="240" w:lineRule="auto"/>
+            </w:pPr>
+            <w:r>
+              <w:rPr>
+                <w:sz w:val="19"/>
+              </w:rPr>
+              <w:t>Text, language, local model files</w:t>
+            </w:r>
+          </w:p>
+        </w:tc>
+        <w:tc>
+          <w:tcPr>
+            <w:tcW w:w="2069" w:type="dxa"/>
+            <w:shd w:val="clear" w:color="auto" w:fill="F6F7F9"/>
+          </w:tcPr>
+          <w:p>
+            <w:pPr>
+              <w:keepNext/>
+              <w:spacing w:after="40" w:line="240" w:lineRule="auto"/>
+            </w:pPr>
+            <w:r>
+              <w:rPr>
+                <w:sz w:val="19"/>
+              </w:rPr>
+              <w:t>Scored candidates, never downloaded</w:t>
+            </w:r>
+          </w:p>
+        </w:tc>
+      </w:tr>
+      <w:tr>
+        <w:trPr>
+          <w:cantSplit/>
+          <w:jc w:val="center"/>
+        </w:trPr>
+        <w:tc>
+          <w:tcPr>
+            <w:tcW w:w="2069" w:type="dxa"/>
+          </w:tcPr>
+          <w:p>
+            <w:pPr>
+              <w:keepNext/>
+              <w:spacing w:after="40" w:line="240" w:lineRule="auto"/>
+            </w:pPr>
+            <w:r>
+              <w:rPr>
+                <w:sz w:val="19"/>
+              </w:rPr>
+              <w:t>Cleaning</w:t>
+            </w:r>
+          </w:p>
+        </w:tc>
+        <w:tc>
+          <w:tcPr>
+            <w:tcW w:w="4224" w:type="dxa"/>
+          </w:tcPr>
+          <w:p>
+            <w:pPr>
+              <w:keepNext/>
+              <w:spacing w:after="40" w:line="240" w:lineRule="auto"/>
+            </w:pPr>
+            <w:r>
+              <w:rPr>
+                <w:rFonts w:ascii="Consolas" w:hAnsi="Consolas"/>
+                <w:color w:val="1F3A5F"/>
+                <w:sz w:val="17"/>
+              </w:rPr>
+              <w:t>detection/analysis_view.py</w:t>
+            </w:r>
+            <w:r>
+              <w:rPr>
+                <w:sz w:val="19"/>
+              </w:rPr>
+              <w:t xml:space="preserve">, </w:t>
+            </w:r>
+            <w:r>
+              <w:rPr>
+                <w:rFonts w:ascii="Consolas" w:hAnsi="Consolas"/>
+                <w:color w:val="1F3A5F"/>
+                <w:sz w:val="17"/>
+              </w:rPr>
+              <w:t>exclusions.py</w:t>
+            </w:r>
+            <w:r>
+              <w:rPr>
+                <w:sz w:val="19"/>
+              </w:rPr>
+              <w:t xml:space="preserve">, </w:t>
+            </w:r>
+            <w:r>
+              <w:rPr>
+                <w:rFonts w:ascii="Consolas" w:hAnsi="Consolas"/>
+                <w:color w:val="1F3A5F"/>
+                <w:sz w:val="17"/>
+              </w:rPr>
+              <w:t>merge.py</w:t>
+            </w:r>
+            <w:r>
+              <w:rPr>
+                <w:sz w:val="19"/>
+              </w:rPr>
+              <w:t xml:space="preserve">, </w:t>
+            </w:r>
+            <w:r>
+              <w:rPr>
+                <w:rFonts w:ascii="Consolas" w:hAnsi="Consolas"/>
+                <w:color w:val="1F3A5F"/>
+                <w:sz w:val="17"/>
+              </w:rPr>
+              <w:t>conflicts.py</w:t>
+            </w:r>
+            <w:r>
+              <w:rPr>
+                <w:sz w:val="19"/>
+              </w:rPr>
+              <w:t xml:space="preserve">, </w:t>
+            </w:r>
+            <w:r>
+              <w:rPr>
+                <w:rFonts w:ascii="Consolas" w:hAnsi="Consolas"/>
+                <w:color w:val="1F3A5F"/>
+                <w:sz w:val="17"/>
+              </w:rPr>
+              <w:t>organization_bounds.py</w:t>
+            </w:r>
+            <w:r>
+              <w:rPr>
+                <w:sz w:val="19"/>
+              </w:rPr>
+              <w:t xml:space="preserve">, </w:t>
+            </w:r>
+            <w:r>
+              <w:rPr>
+                <w:rFonts w:ascii="Consolas" w:hAnsi="Consolas"/>
+                <w:color w:val="1F3A5F"/>
+                <w:sz w:val="17"/>
+              </w:rPr>
+              <w:t>aliases.py</w:t>
+            </w:r>
+            <w:r>
+              <w:rPr>
+                <w:sz w:val="19"/>
+              </w:rPr>
+              <w:t xml:space="preserve">, </w:t>
+            </w:r>
+            <w:r>
+              <w:rPr>
+                <w:rFonts w:ascii="Consolas" w:hAnsi="Consolas"/>
+                <w:color w:val="1F3A5F"/>
+                <w:sz w:val="17"/>
+              </w:rPr>
+              <w:t>propagation.py</w:t>
+            </w:r>
+          </w:p>
+        </w:tc>
+        <w:tc>
+          <w:tcPr>
+            <w:tcW w:w="1843" w:type="dxa"/>
+          </w:tcPr>
+          <w:p>
+            <w:pPr>
+              <w:keepNext/>
+              <w:spacing w:after="40" w:line="240" w:lineRule="auto"/>
+            </w:pPr>
+            <w:r>
+              <w:rPr>
+                <w:sz w:val="19"/>
+              </w:rPr>
+              <w:t>All candidates</w:t>
+            </w:r>
+          </w:p>
+        </w:tc>
+        <w:tc>
+          <w:tcPr>
+            <w:tcW w:w="2069" w:type="dxa"/>
+          </w:tcPr>
+          <w:p>
+            <w:pPr>
+              <w:keepNext/>
+              <w:spacing w:after="40" w:line="240" w:lineRule="auto"/>
+            </w:pPr>
+            <w:r>
+              <w:rPr>
+                <w:sz w:val="19"/>
+              </w:rPr>
+              <w:t>Sorted detections without overlap</w:t>
+            </w:r>
+          </w:p>
+        </w:tc>
+      </w:tr>
+      <w:tr>
+        <w:trPr>
+          <w:cantSplit/>
+          <w:jc w:val="center"/>
+        </w:trPr>
+        <w:tc>
+          <w:tcPr>
+            <w:tcW w:w="2069" w:type="dxa"/>
+            <w:shd w:val="clear" w:color="auto" w:fill="F6F7F9"/>
+          </w:tcPr>
+          <w:p>
+            <w:pPr>
+              <w:keepNext/>
+              <w:spacing w:after="40" w:line="240" w:lineRule="auto"/>
+            </w:pPr>
+            <w:r>
+              <w:rPr>
+                <w:sz w:val="19"/>
+              </w:rPr>
+              <w:t>Orchestration</w:t>
+            </w:r>
+          </w:p>
+        </w:tc>
+        <w:tc>
+          <w:tcPr>
+            <w:tcW w:w="4224" w:type="dxa"/>
+            <w:shd w:val="clear" w:color="auto" w:fill="F6F7F9"/>
+          </w:tcPr>
+          <w:p>
+            <w:pPr>
+              <w:keepNext/>
+              <w:spacing w:after="40" w:line="240" w:lineRule="auto"/>
+            </w:pPr>
+            <w:r>
+              <w:rPr>
+                <w:rFonts w:ascii="Consolas" w:hAnsi="Consolas"/>
+                <w:color w:val="1F3A5F"/>
+                <w:sz w:val="17"/>
+              </w:rPr>
+              <w:t>detection/pipeline.py</w:t>
+            </w:r>
+            <w:r>
+              <w:rPr>
+                <w:sz w:val="19"/>
+              </w:rPr>
+              <w:t xml:space="preserve">, function </w:t>
+            </w:r>
+            <w:r>
+              <w:rPr>
+                <w:rFonts w:ascii="Consolas" w:hAnsi="Consolas"/>
+                <w:color w:val="1F3A5F"/>
+                <w:sz w:val="17"/>
+              </w:rPr>
+              <w:t>detect(text, config, known)</w:t>
+            </w:r>
+          </w:p>
+        </w:tc>
+        <w:tc>
+          <w:tcPr>
+            <w:tcW w:w="1843" w:type="dxa"/>
+            <w:shd w:val="clear" w:color="auto" w:fill="F6F7F9"/>
+          </w:tcPr>
+          <w:p>
+            <w:pPr>
+              <w:keepNext/>
+              <w:spacing w:after="40" w:line="240" w:lineRule="auto"/>
+            </w:pPr>
+            <w:r>
+              <w:rPr>
+                <w:sz w:val="19"/>
+              </w:rPr>
+              <w:t>Text, configuration, known values</w:t>
+            </w:r>
+          </w:p>
+        </w:tc>
+        <w:tc>
+          <w:tcPr>
+            <w:tcW w:w="2069" w:type="dxa"/>
+            <w:shd w:val="clear" w:color="auto" w:fill="F6F7F9"/>
+          </w:tcPr>
+          <w:p>
+            <w:pPr>
+              <w:keepNext/>
+              <w:spacing w:after="40" w:line="240" w:lineRule="auto"/>
+            </w:pPr>
+            <w:r>
+              <w:rPr>
+                <w:sz w:val="19"/>
+              </w:rPr>
+              <w:t xml:space="preserve">The list of </w:t>
+            </w:r>
+            <w:r>
+              <w:rPr>
+                <w:rFonts w:ascii="Consolas" w:hAnsi="Consolas"/>
+                <w:color w:val="1F3A5F"/>
+                <w:sz w:val="17"/>
+              </w:rPr>
+              <w:t>Detection</w:t>
+            </w:r>
+            <w:r>
+              <w:rPr>
+                <w:sz w:val="19"/>
+              </w:rPr>
+              <w:t xml:space="preserve"> shown in Review</w:t>
+            </w:r>
+          </w:p>
+        </w:tc>
+      </w:tr>
+      <w:tr>
+        <w:trPr>
+          <w:cantSplit/>
+          <w:jc w:val="center"/>
+        </w:trPr>
+        <w:tc>
+          <w:tcPr>
+            <w:tcW w:w="2069" w:type="dxa"/>
+          </w:tcPr>
+          <w:p>
+            <w:pPr>
+              <w:keepNext/>
+              <w:spacing w:after="40" w:line="240" w:lineRule="auto"/>
+            </w:pPr>
+            <w:r>
+              <w:rPr>
+                <w:sz w:val="19"/>
+              </w:rPr>
+              <w:t>Pseudonymisation</w:t>
+            </w:r>
+          </w:p>
+        </w:tc>
+        <w:tc>
+          <w:tcPr>
+            <w:tcW w:w="4224" w:type="dxa"/>
+          </w:tcPr>
+          <w:p>
+            <w:pPr>
+              <w:keepNext/>
+              <w:spacing w:after="40" w:line="240" w:lineRule="auto"/>
+            </w:pPr>
+            <w:r>
+              <w:rPr>
+                <w:rFonts w:ascii="Consolas" w:hAnsi="Consolas"/>
+                <w:color w:val="1F3A5F"/>
+                <w:sz w:val="17"/>
+              </w:rPr>
+              <w:t>pseudonymize/grouping.py</w:t>
+            </w:r>
+            <w:r>
+              <w:rPr>
+                <w:sz w:val="19"/>
+              </w:rPr>
+              <w:t xml:space="preserve">, </w:t>
+            </w:r>
+            <w:r>
+              <w:rPr>
+                <w:rFonts w:ascii="Consolas" w:hAnsi="Consolas"/>
+                <w:color w:val="1F3A5F"/>
+                <w:sz w:val="17"/>
+              </w:rPr>
+              <w:t>tokens.py</w:t>
+            </w:r>
+            <w:r>
+              <w:rPr>
+                <w:sz w:val="19"/>
+              </w:rPr>
+              <w:t xml:space="preserve">, </w:t>
+            </w:r>
+            <w:r>
+              <w:rPr>
+                <w:rFonts w:ascii="Consolas" w:hAnsi="Consolas"/>
+                <w:color w:val="1F3A5F"/>
+                <w:sz w:val="17"/>
+              </w:rPr>
+              <w:t>mapping.py</w:t>
+            </w:r>
+            <w:r>
+              <w:rPr>
+                <w:sz w:val="19"/>
+              </w:rPr>
+              <w:t xml:space="preserve">, </w:t>
+            </w:r>
+            <w:r>
+              <w:rPr>
+                <w:rFonts w:ascii="Consolas" w:hAnsi="Consolas"/>
+                <w:color w:val="1F3A5F"/>
+                <w:sz w:val="17"/>
+              </w:rPr>
+              <w:t>case_memory.py</w:t>
+            </w:r>
+          </w:p>
+        </w:tc>
+        <w:tc>
+          <w:tcPr>
+            <w:tcW w:w="1843" w:type="dxa"/>
+          </w:tcPr>
+          <w:p>
+            <w:pPr>
+              <w:keepNext/>
+              <w:spacing w:after="40" w:line="240" w:lineRule="auto"/>
+            </w:pPr>
+            <w:r>
+              <w:rPr>
+                <w:sz w:val="19"/>
+              </w:rPr>
+              <w:t>Reviewed detections</w:t>
+            </w:r>
+          </w:p>
+        </w:tc>
+        <w:tc>
+          <w:tcPr>
+            <w:tcW w:w="2069" w:type="dxa"/>
+          </w:tcPr>
+          <w:p>
+            <w:pPr>
+              <w:keepNext/>
+              <w:spacing w:after="40" w:line="240" w:lineRule="auto"/>
+            </w:pPr>
+            <w:r>
+              <w:rPr>
+                <w:sz w:val="19"/>
+              </w:rPr>
+              <w:t>Tokenised text, groups, mapping table</w:t>
+            </w:r>
+          </w:p>
+        </w:tc>
+      </w:tr>
+      <w:tr>
+        <w:trPr>
+          <w:cantSplit/>
+          <w:jc w:val="center"/>
+        </w:trPr>
+        <w:tc>
+          <w:tcPr>
+            <w:tcW w:w="2069" w:type="dxa"/>
+            <w:shd w:val="clear" w:color="auto" w:fill="F6F7F9"/>
+          </w:tcPr>
+          <w:p>
+            <w:pPr>
+              <w:keepNext/>
+              <w:spacing w:after="40" w:line="240" w:lineRule="auto"/>
+            </w:pPr>
+            <w:r>
+              <w:rPr>
+                <w:sz w:val="19"/>
+              </w:rPr>
+              <w:t>Checks</w:t>
+            </w:r>
+          </w:p>
+        </w:tc>
+        <w:tc>
+          <w:tcPr>
+            <w:tcW w:w="4224" w:type="dxa"/>
+            <w:shd w:val="clear" w:color="auto" w:fill="F6F7F9"/>
+          </w:tcPr>
+          <w:p>
+            <w:pPr>
+              <w:keepNext/>
+              <w:spacing w:after="40" w:line="240" w:lineRule="auto"/>
+            </w:pPr>
+            <w:r>
+              <w:rPr>
+                <w:rFonts w:ascii="Consolas" w:hAnsi="Consolas"/>
+                <w:color w:val="1F3A5F"/>
+                <w:sz w:val="17"/>
+              </w:rPr>
+              <w:t>pseudonymize/final_check.py</w:t>
+            </w:r>
+            <w:r>
+              <w:rPr>
+                <w:sz w:val="19"/>
+              </w:rPr>
+              <w:t xml:space="preserve">, </w:t>
+            </w:r>
+            <w:r>
+              <w:rPr>
+                <w:rFonts w:ascii="Consolas" w:hAnsi="Consolas"/>
+                <w:color w:val="1F3A5F"/>
+                <w:sz w:val="17"/>
+              </w:rPr>
+              <w:t>outbound_check.py</w:t>
+            </w:r>
+          </w:p>
+        </w:tc>
+        <w:tc>
+          <w:tcPr>
+            <w:tcW w:w="1843" w:type="dxa"/>
+            <w:shd w:val="clear" w:color="auto" w:fill="F6F7F9"/>
+          </w:tcPr>
+          <w:p>
+            <w:pPr>
+              <w:keepNext/>
+              <w:spacing w:after="40" w:line="240" w:lineRule="auto"/>
+            </w:pPr>
+            <w:r>
+              <w:rPr>
+                <w:sz w:val="19"/>
+              </w:rPr>
+              <w:t>Tokenised text, instruction, original text</w:t>
+            </w:r>
+          </w:p>
+        </w:tc>
+        <w:tc>
+          <w:tcPr>
+            <w:tcW w:w="2069" w:type="dxa"/>
+            <w:shd w:val="clear" w:color="auto" w:fill="F6F7F9"/>
+          </w:tcPr>
+          <w:p>
+            <w:pPr>
+              <w:keepNext/>
+              <w:spacing w:after="40" w:line="240" w:lineRule="auto"/>
+            </w:pPr>
+            <w:r>
+              <w:rPr>
+                <w:sz w:val="19"/>
+              </w:rPr>
+              <w:t>Exact outgoing message, alerts, status</w:t>
+            </w:r>
+          </w:p>
+        </w:tc>
+      </w:tr>
+      <w:tr>
+        <w:trPr>
+          <w:cantSplit/>
+          <w:jc w:val="center"/>
+        </w:trPr>
+        <w:tc>
+          <w:tcPr>
+            <w:tcW w:w="2069" w:type="dxa"/>
+          </w:tcPr>
+          <w:p>
+            <w:pPr>
+              <w:keepNext/>
+              <w:spacing w:after="40" w:line="240" w:lineRule="auto"/>
+            </w:pPr>
+            <w:r>
+              <w:rPr>
+                <w:sz w:val="19"/>
+              </w:rPr>
+              <w:t>Restoration</w:t>
+            </w:r>
+          </w:p>
+        </w:tc>
+        <w:tc>
+          <w:tcPr>
+            <w:tcW w:w="4224" w:type="dxa"/>
+          </w:tcPr>
+          <w:p>
+            <w:pPr>
+              <w:keepNext/>
+              <w:spacing w:after="40" w:line="240" w:lineRule="auto"/>
+            </w:pPr>
+            <w:r>
+              <w:rPr>
+                <w:rFonts w:ascii="Consolas" w:hAnsi="Consolas"/>
+                <w:color w:val="1F3A5F"/>
+                <w:sz w:val="17"/>
+              </w:rPr>
+              <w:t>pseudonymize/reidentify.py</w:t>
+            </w:r>
+            <w:r>
+              <w:rPr>
+                <w:sz w:val="19"/>
+              </w:rPr>
+              <w:t xml:space="preserve">, function </w:t>
+            </w:r>
+            <w:r>
+              <w:rPr>
+                <w:rFonts w:ascii="Consolas" w:hAnsi="Consolas"/>
+                <w:color w:val="1F3A5F"/>
+                <w:sz w:val="17"/>
+              </w:rPr>
+              <w:t>restore</w:t>
+            </w:r>
+          </w:p>
+        </w:tc>
+        <w:tc>
+          <w:tcPr>
+            <w:tcW w:w="1843" w:type="dxa"/>
+          </w:tcPr>
+          <w:p>
+            <w:pPr>
+              <w:keepNext/>
+              <w:spacing w:after="40" w:line="240" w:lineRule="auto"/>
+            </w:pPr>
+            <w:r>
+              <w:rPr>
+                <w:sz w:val="19"/>
+              </w:rPr>
+              <w:t>Answer and table</w:t>
+            </w:r>
+          </w:p>
+        </w:tc>
+        <w:tc>
+          <w:tcPr>
+            <w:tcW w:w="2069" w:type="dxa"/>
+          </w:tcPr>
+          <w:p>
+            <w:pPr>
+              <w:keepNext/>
+              <w:spacing w:after="40" w:line="240" w:lineRule="auto"/>
+            </w:pPr>
+            <w:r>
+              <w:rPr>
+                <w:sz w:val="19"/>
+              </w:rPr>
+              <w:t>Restored text, exact or tolerant mode, unknown tokens</w:t>
+            </w:r>
+          </w:p>
+        </w:tc>
+      </w:tr>
+      <w:tr>
+        <w:trPr>
+          <w:cantSplit/>
+          <w:jc w:val="center"/>
+        </w:trPr>
+        <w:tc>
+          <w:tcPr>
+            <w:tcW w:w="2069" w:type="dxa"/>
+            <w:shd w:val="clear" w:color="auto" w:fill="F6F7F9"/>
+          </w:tcPr>
+          <w:p>
+            <w:pPr>
+              <w:keepNext/>
+              <w:spacing w:after="40" w:line="240" w:lineRule="auto"/>
+            </w:pPr>
+            <w:r>
+              <w:rPr>
+                <w:sz w:val="19"/>
+              </w:rPr>
+              <w:t>Connector</w:t>
+            </w:r>
+          </w:p>
+        </w:tc>
+        <w:tc>
+          <w:tcPr>
+            <w:tcW w:w="4224" w:type="dxa"/>
+            <w:shd w:val="clear" w:color="auto" w:fill="F6F7F9"/>
+          </w:tcPr>
+          <w:p>
+            <w:pPr>
+              <w:keepNext/>
+              <w:spacing w:after="40" w:line="240" w:lineRule="auto"/>
+            </w:pPr>
+            <w:r>
+              <w:rPr>
+                <w:rFonts w:ascii="Consolas" w:hAnsi="Consolas"/>
+                <w:color w:val="1F3A5F"/>
+                <w:sz w:val="17"/>
+              </w:rPr>
+              <w:t>src/huisclos/llm/mistral_client.py</w:t>
+            </w:r>
+            <w:r>
+              <w:rPr>
+                <w:sz w:val="19"/>
+              </w:rPr>
+              <w:t xml:space="preserve">, </w:t>
+            </w:r>
+            <w:r>
+              <w:rPr>
+                <w:rFonts w:ascii="Consolas" w:hAnsi="Consolas"/>
+                <w:color w:val="1F3A5F"/>
+                <w:sz w:val="17"/>
+              </w:rPr>
+              <w:t>send_outbound</w:t>
+            </w:r>
+          </w:p>
+        </w:tc>
+        <w:tc>
+          <w:tcPr>
+            <w:tcW w:w="1843" w:type="dxa"/>
+            <w:shd w:val="clear" w:color="auto" w:fill="F6F7F9"/>
+          </w:tcPr>
+          <w:p>
+            <w:pPr>
+              <w:keepNext/>
+              <w:spacing w:after="40" w:line="240" w:lineRule="auto"/>
+            </w:pPr>
+            <w:r>
+              <w:rPr>
+                <w:sz w:val="19"/>
+              </w:rPr>
+              <w:t>Checked message, API key</w:t>
+            </w:r>
+          </w:p>
+        </w:tc>
+        <w:tc>
+          <w:tcPr>
+            <w:tcW w:w="2069" w:type="dxa"/>
+            <w:shd w:val="clear" w:color="auto" w:fill="F6F7F9"/>
+          </w:tcPr>
+          <w:p>
+            <w:pPr>
+              <w:keepNext/>
+              <w:spacing w:after="40" w:line="240" w:lineRule="auto"/>
+            </w:pPr>
+            <w:r>
+              <w:rPr>
+                <w:sz w:val="19"/>
+              </w:rPr>
+              <w:t>Model answer or clear error</w:t>
+            </w:r>
+          </w:p>
+        </w:tc>
+      </w:tr>
+      <w:tr>
+        <w:trPr>
+          <w:cantSplit/>
           <w:jc w:val="center"/>
         </w:trPr>
         <w:tc>
@@ -1791,7 +3469,7 @@
               <w:rPr>
                 <w:sz w:val="19"/>
               </w:rPr>
-              <w:t>Entry point</w:t>
+              <w:t>Evaluation</w:t>
             </w:r>
           </w:p>
         </w:tc>
@@ -1809,7 +3487,35 @@
                 <w:color w:val="1F3A5F"/>
                 <w:sz w:val="17"/>
               </w:rPr>
-              <w:t>streamlit_app.py</w:t>
+              <w:t>src/huisclos/evaluation/</w:t>
+            </w:r>
+            <w:r>
+              <w:rPr>
+                <w:sz w:val="19"/>
+              </w:rPr>
+              <w:t xml:space="preserve">, </w:t>
+            </w:r>
+            <w:r>
+              <w:rPr>
+                <w:rFonts w:ascii="Consolas" w:hAnsi="Consolas"/>
+                <w:color w:val="1F3A5F"/>
+                <w:sz w:val="17"/>
+              </w:rPr>
+              <w:t>scripts/run_evaluation.py</w:t>
+            </w:r>
+            <w:r>
+              <w:rPr>
+                <w:sz w:val="19"/>
+              </w:rPr>
+              <w:t xml:space="preserve">, </w:t>
+            </w:r>
+            <w:r>
+              <w:rPr>
+                <w:rFonts w:ascii="Consolas" w:hAnsi="Consolas"/>
+                <w:color w:val="1F3A5F"/>
+                <w:sz w:val="17"/>
+              </w:rPr>
+              <w:t>scripts/evaluate_robustness.py</w:t>
             </w:r>
           </w:p>
         </w:tc>
@@ -1825,1512 +3531,6 @@
               <w:rPr>
                 <w:sz w:val="19"/>
               </w:rPr>
-              <w:t>Browser request</w:t>
-            </w:r>
-          </w:p>
-        </w:tc>
-        <w:tc>
-          <w:tcPr>
-            <w:tcW w:w="2069" w:type="dxa"/>
-          </w:tcPr>
-          <w:p>
-            <w:pPr>
-              <w:spacing w:after="40" w:line="240" w:lineRule="auto"/>
-            </w:pPr>
-            <w:r>
-              <w:rPr>
-                <w:sz w:val="19"/>
-              </w:rPr>
-              <w:t>Pages Pseudonymize, Method &amp; limits, Evaluation (hidden)</w:t>
-            </w:r>
-          </w:p>
-        </w:tc>
-      </w:tr>
-      <w:tr>
-        <w:trPr>
-          <w:jc w:val="center"/>
-        </w:trPr>
-        <w:tc>
-          <w:tcPr>
-            <w:tcW w:w="2069" w:type="dxa"/>
-            <w:shd w:val="clear" w:color="auto" w:fill="F6F7F9"/>
-          </w:tcPr>
-          <w:p>
-            <w:pPr>
-              <w:spacing w:after="40" w:line="240" w:lineRule="auto"/>
-            </w:pPr>
-            <w:r>
-              <w:rPr>
-                <w:sz w:val="19"/>
-              </w:rPr>
-              <w:t>Interface</w:t>
-            </w:r>
-          </w:p>
-        </w:tc>
-        <w:tc>
-          <w:tcPr>
-            <w:tcW w:w="4224" w:type="dxa"/>
-            <w:shd w:val="clear" w:color="auto" w:fill="F6F7F9"/>
-          </w:tcPr>
-          <w:p>
-            <w:pPr>
-              <w:spacing w:after="40" w:line="240" w:lineRule="auto"/>
-            </w:pPr>
-            <w:r>
-              <w:rPr>
-                <w:rFonts w:ascii="Consolas" w:hAnsi="Consolas"/>
-                <w:color w:val="1F3A5F"/>
-                <w:sz w:val="17"/>
-              </w:rPr>
-              <w:t>app/</w:t>
-            </w:r>
-            <w:r>
-              <w:rPr>
-                <w:sz w:val="19"/>
-              </w:rPr>
-              <w:t xml:space="preserve"> (</w:t>
-            </w:r>
-            <w:r>
-              <w:rPr>
-                <w:rFonts w:ascii="Consolas" w:hAnsi="Consolas"/>
-                <w:color w:val="1F3A5F"/>
-                <w:sz w:val="17"/>
-              </w:rPr>
-              <w:t>state.py</w:t>
-            </w:r>
-            <w:r>
-              <w:rPr>
-                <w:sz w:val="19"/>
-              </w:rPr>
-              <w:t xml:space="preserve">, </w:t>
-            </w:r>
-            <w:r>
-              <w:rPr>
-                <w:rFonts w:ascii="Consolas" w:hAnsi="Consolas"/>
-                <w:color w:val="1F3A5F"/>
-                <w:sz w:val="17"/>
-              </w:rPr>
-              <w:t>sidebar.py</w:t>
-            </w:r>
-            <w:r>
-              <w:rPr>
-                <w:sz w:val="19"/>
-              </w:rPr>
-              <w:t xml:space="preserve">, </w:t>
-            </w:r>
-            <w:r>
-              <w:rPr>
-                <w:rFonts w:ascii="Consolas" w:hAnsi="Consolas"/>
-                <w:color w:val="1F3A5F"/>
-                <w:sz w:val="17"/>
-              </w:rPr>
-              <w:t>engine.py</w:t>
-            </w:r>
-            <w:r>
-              <w:rPr>
-                <w:sz w:val="19"/>
-              </w:rPr>
-              <w:t xml:space="preserve">, </w:t>
-            </w:r>
-            <w:r>
-              <w:rPr>
-                <w:rFonts w:ascii="Consolas" w:hAnsi="Consolas"/>
-                <w:color w:val="1F3A5F"/>
-                <w:sz w:val="17"/>
-              </w:rPr>
-              <w:t>fingerprints.py</w:t>
-            </w:r>
-            <w:r>
-              <w:rPr>
-                <w:sz w:val="19"/>
-              </w:rPr>
-              <w:t xml:space="preserve">, </w:t>
-            </w:r>
-            <w:r>
-              <w:rPr>
-                <w:rFonts w:ascii="Consolas" w:hAnsi="Consolas"/>
-                <w:color w:val="1F3A5F"/>
-                <w:sz w:val="17"/>
-              </w:rPr>
-              <w:t>steps/</w:t>
-            </w:r>
-            <w:r>
-              <w:rPr>
-                <w:sz w:val="19"/>
-              </w:rPr>
-              <w:t xml:space="preserve">, </w:t>
-            </w:r>
-            <w:r>
-              <w:rPr>
-                <w:rFonts w:ascii="Consolas" w:hAnsi="Consolas"/>
-                <w:color w:val="1F3A5F"/>
-                <w:sz w:val="17"/>
-              </w:rPr>
-              <w:t>components/</w:t>
-            </w:r>
-            <w:r>
-              <w:rPr>
-                <w:sz w:val="19"/>
-              </w:rPr>
-              <w:t xml:space="preserve">, </w:t>
-            </w:r>
-            <w:r>
-              <w:rPr>
-                <w:rFonts w:ascii="Consolas" w:hAnsi="Consolas"/>
-                <w:color w:val="1F3A5F"/>
-                <w:sz w:val="17"/>
-              </w:rPr>
-              <w:t>pages/</w:t>
-            </w:r>
-            <w:r>
-              <w:rPr>
-                <w:sz w:val="19"/>
-              </w:rPr>
-              <w:t xml:space="preserve">, </w:t>
-            </w:r>
-            <w:r>
-              <w:rPr>
-                <w:rFonts w:ascii="Consolas" w:hAnsi="Consolas"/>
-                <w:color w:val="1F3A5F"/>
-                <w:sz w:val="17"/>
-              </w:rPr>
-              <w:t>i18n/</w:t>
-            </w:r>
-            <w:r>
-              <w:rPr>
-                <w:sz w:val="19"/>
-              </w:rPr>
-              <w:t xml:space="preserve">, </w:t>
-            </w:r>
-            <w:r>
-              <w:rPr>
-                <w:rFonts w:ascii="Consolas" w:hAnsi="Consolas"/>
-                <w:color w:val="1F3A5F"/>
-                <w:sz w:val="17"/>
-              </w:rPr>
-              <w:t>assets/style.css</w:t>
-            </w:r>
-            <w:r>
-              <w:rPr>
-                <w:sz w:val="19"/>
-              </w:rPr>
-              <w:t>)</w:t>
-            </w:r>
-          </w:p>
-        </w:tc>
-        <w:tc>
-          <w:tcPr>
-            <w:tcW w:w="1843" w:type="dxa"/>
-            <w:shd w:val="clear" w:color="auto" w:fill="F6F7F9"/>
-          </w:tcPr>
-          <w:p>
-            <w:pPr>
-              <w:spacing w:after="40" w:line="240" w:lineRule="auto"/>
-            </w:pPr>
-            <w:r>
-              <w:rPr>
-                <w:sz w:val="19"/>
-              </w:rPr>
-              <w:t>User actions</w:t>
-            </w:r>
-          </w:p>
-        </w:tc>
-        <w:tc>
-          <w:tcPr>
-            <w:tcW w:w="2069" w:type="dxa"/>
-            <w:shd w:val="clear" w:color="auto" w:fill="F6F7F9"/>
-          </w:tcPr>
-          <w:p>
-            <w:pPr>
-              <w:spacing w:after="40" w:line="240" w:lineRule="auto"/>
-            </w:pPr>
-            <w:r>
-              <w:rPr>
-                <w:sz w:val="19"/>
-              </w:rPr>
-              <w:t>Screens, session state, messages in English or French</w:t>
-            </w:r>
-          </w:p>
-        </w:tc>
-      </w:tr>
-      <w:tr>
-        <w:trPr>
-          <w:jc w:val="center"/>
-        </w:trPr>
-        <w:tc>
-          <w:tcPr>
-            <w:tcW w:w="2069" w:type="dxa"/>
-          </w:tcPr>
-          <w:p>
-            <w:pPr>
-              <w:spacing w:after="40" w:line="240" w:lineRule="auto"/>
-            </w:pPr>
-            <w:r>
-              <w:rPr>
-                <w:sz w:val="19"/>
-              </w:rPr>
-              <w:t>Shared contract</w:t>
-            </w:r>
-          </w:p>
-        </w:tc>
-        <w:tc>
-          <w:tcPr>
-            <w:tcW w:w="4224" w:type="dxa"/>
-          </w:tcPr>
-          <w:p>
-            <w:pPr>
-              <w:spacing w:after="40" w:line="240" w:lineRule="auto"/>
-            </w:pPr>
-            <w:r>
-              <w:rPr>
-                <w:rFonts w:ascii="Consolas" w:hAnsi="Consolas"/>
-                <w:color w:val="1F3A5F"/>
-                <w:sz w:val="17"/>
-              </w:rPr>
-              <w:t>src/huisclos/models.py</w:t>
-            </w:r>
-            <w:r>
-              <w:rPr>
-                <w:sz w:val="19"/>
-              </w:rPr>
-              <w:t xml:space="preserve">, </w:t>
-            </w:r>
-            <w:r>
-              <w:rPr>
-                <w:rFonts w:ascii="Consolas" w:hAnsi="Consolas"/>
-                <w:color w:val="1F3A5F"/>
-                <w:sz w:val="17"/>
-              </w:rPr>
-              <w:t>config.py</w:t>
-            </w:r>
-            <w:r>
-              <w:rPr>
-                <w:sz w:val="19"/>
-              </w:rPr>
-              <w:t xml:space="preserve">, </w:t>
-            </w:r>
-            <w:r>
-              <w:rPr>
-                <w:rFonts w:ascii="Consolas" w:hAnsi="Consolas"/>
-                <w:color w:val="1F3A5F"/>
-                <w:sz w:val="17"/>
-              </w:rPr>
-              <w:t>text_utils.py</w:t>
-            </w:r>
-          </w:p>
-        </w:tc>
-        <w:tc>
-          <w:tcPr>
-            <w:tcW w:w="1843" w:type="dxa"/>
-          </w:tcPr>
-          <w:p>
-            <w:pPr>
-              <w:spacing w:after="40" w:line="240" w:lineRule="auto"/>
-            </w:pPr>
-            <w:r>
-              <w:rPr>
-                <w:sz w:val="19"/>
-              </w:rPr>
-              <w:t>None</w:t>
-            </w:r>
-          </w:p>
-        </w:tc>
-        <w:tc>
-          <w:tcPr>
-            <w:tcW w:w="2069" w:type="dxa"/>
-          </w:tcPr>
-          <w:p>
-            <w:pPr>
-              <w:spacing w:after="40" w:line="240" w:lineRule="auto"/>
-            </w:pPr>
-            <w:r>
-              <w:rPr>
-                <w:sz w:val="19"/>
-              </w:rPr>
-              <w:t xml:space="preserve">Entity types, sources, </w:t>
-            </w:r>
-            <w:r>
-              <w:rPr>
-                <w:rFonts w:ascii="Consolas" w:hAnsi="Consolas"/>
-                <w:color w:val="1F3A5F"/>
-                <w:sz w:val="17"/>
-              </w:rPr>
-              <w:t>Detection</w:t>
-            </w:r>
-            <w:r>
-              <w:rPr>
-                <w:sz w:val="19"/>
-              </w:rPr>
-              <w:t xml:space="preserve">, token style, </w:t>
-            </w:r>
-            <w:r>
-              <w:rPr>
-                <w:rFonts w:ascii="Consolas" w:hAnsi="Consolas"/>
-                <w:color w:val="1F3A5F"/>
-                <w:sz w:val="17"/>
-              </w:rPr>
-              <w:t>DetectionConfig</w:t>
-            </w:r>
-            <w:r>
-              <w:rPr>
-                <w:sz w:val="19"/>
-              </w:rPr>
-              <w:t>, profiles</w:t>
-            </w:r>
-          </w:p>
-        </w:tc>
-      </w:tr>
-      <w:tr>
-        <w:trPr>
-          <w:jc w:val="center"/>
-        </w:trPr>
-        <w:tc>
-          <w:tcPr>
-            <w:tcW w:w="2069" w:type="dxa"/>
-            <w:shd w:val="clear" w:color="auto" w:fill="F6F7F9"/>
-          </w:tcPr>
-          <w:p>
-            <w:pPr>
-              <w:spacing w:after="40" w:line="240" w:lineRule="auto"/>
-            </w:pPr>
-            <w:r>
-              <w:rPr>
-                <w:sz w:val="19"/>
-              </w:rPr>
-              <w:t>Reading and writing</w:t>
-            </w:r>
-          </w:p>
-        </w:tc>
-        <w:tc>
-          <w:tcPr>
-            <w:tcW w:w="4224" w:type="dxa"/>
-            <w:shd w:val="clear" w:color="auto" w:fill="F6F7F9"/>
-          </w:tcPr>
-          <w:p>
-            <w:pPr>
-              <w:spacing w:after="40" w:line="240" w:lineRule="auto"/>
-            </w:pPr>
-            <w:r>
-              <w:rPr>
-                <w:rFonts w:ascii="Consolas" w:hAnsi="Consolas"/>
-                <w:color w:val="1F3A5F"/>
-                <w:sz w:val="17"/>
-              </w:rPr>
-              <w:t>src/huisclos/io/</w:t>
-            </w:r>
-            <w:r>
-              <w:rPr>
-                <w:sz w:val="19"/>
-              </w:rPr>
-              <w:t xml:space="preserve"> (</w:t>
-            </w:r>
-            <w:r>
-              <w:rPr>
-                <w:rFonts w:ascii="Consolas" w:hAnsi="Consolas"/>
-                <w:color w:val="1F3A5F"/>
-                <w:sz w:val="17"/>
-              </w:rPr>
-              <w:t>readers.py</w:t>
-            </w:r>
-            <w:r>
-              <w:rPr>
-                <w:sz w:val="19"/>
-              </w:rPr>
-              <w:t xml:space="preserve">, </w:t>
-            </w:r>
-            <w:r>
-              <w:rPr>
-                <w:rFonts w:ascii="Consolas" w:hAnsi="Consolas"/>
-                <w:color w:val="1F3A5F"/>
-                <w:sz w:val="17"/>
-              </w:rPr>
-              <w:t>read_quality.py</w:t>
-            </w:r>
-            <w:r>
-              <w:rPr>
-                <w:sz w:val="19"/>
-              </w:rPr>
-              <w:t xml:space="preserve">, </w:t>
-            </w:r>
-            <w:r>
-              <w:rPr>
-                <w:rFonts w:ascii="Consolas" w:hAnsi="Consolas"/>
-                <w:color w:val="1F3A5F"/>
-                <w:sz w:val="17"/>
-              </w:rPr>
-              <w:t>writers.py</w:t>
-            </w:r>
-            <w:r>
-              <w:rPr>
-                <w:sz w:val="19"/>
-              </w:rPr>
-              <w:t>)</w:t>
-            </w:r>
-          </w:p>
-        </w:tc>
-        <w:tc>
-          <w:tcPr>
-            <w:tcW w:w="1843" w:type="dxa"/>
-            <w:shd w:val="clear" w:color="auto" w:fill="F6F7F9"/>
-          </w:tcPr>
-          <w:p>
-            <w:pPr>
-              <w:spacing w:after="40" w:line="240" w:lineRule="auto"/>
-            </w:pPr>
-            <w:r>
-              <w:rPr>
-                <w:sz w:val="19"/>
-              </w:rPr>
-              <w:t>File bytes or text</w:t>
-            </w:r>
-          </w:p>
-        </w:tc>
-        <w:tc>
-          <w:tcPr>
-            <w:tcW w:w="2069" w:type="dxa"/>
-            <w:shd w:val="clear" w:color="auto" w:fill="F6F7F9"/>
-          </w:tcPr>
-          <w:p>
-            <w:pPr>
-              <w:spacing w:after="40" w:line="240" w:lineRule="auto"/>
-            </w:pPr>
-            <w:r>
-              <w:rPr>
-                <w:sz w:val="19"/>
-              </w:rPr>
-              <w:t>Normalised text and quality note; .txt and .docx bytes</w:t>
-            </w:r>
-          </w:p>
-        </w:tc>
-      </w:tr>
-      <w:tr>
-        <w:trPr>
-          <w:jc w:val="center"/>
-        </w:trPr>
-        <w:tc>
-          <w:tcPr>
-            <w:tcW w:w="2069" w:type="dxa"/>
-          </w:tcPr>
-          <w:p>
-            <w:pPr>
-              <w:spacing w:after="40" w:line="240" w:lineRule="auto"/>
-            </w:pPr>
-            <w:r>
-              <w:rPr>
-                <w:sz w:val="19"/>
-              </w:rPr>
-              <w:t>Rules</w:t>
-            </w:r>
-          </w:p>
-        </w:tc>
-        <w:tc>
-          <w:tcPr>
-            <w:tcW w:w="4224" w:type="dxa"/>
-          </w:tcPr>
-          <w:p>
-            <w:pPr>
-              <w:spacing w:after="40" w:line="240" w:lineRule="auto"/>
-            </w:pPr>
-            <w:r>
-              <w:rPr>
-                <w:rFonts w:ascii="Consolas" w:hAnsi="Consolas"/>
-                <w:color w:val="1F3A5F"/>
-                <w:sz w:val="17"/>
-              </w:rPr>
-              <w:t>detection/patterns.py</w:t>
-            </w:r>
-            <w:r>
-              <w:rPr>
-                <w:sz w:val="19"/>
-              </w:rPr>
-              <w:t xml:space="preserve">, </w:t>
-            </w:r>
-            <w:r>
-              <w:rPr>
-                <w:rFonts w:ascii="Consolas" w:hAnsi="Consolas"/>
-                <w:color w:val="1F3A5F"/>
-                <w:sz w:val="17"/>
-              </w:rPr>
-              <w:t>english_patterns.py</w:t>
-            </w:r>
-            <w:r>
-              <w:rPr>
-                <w:sz w:val="19"/>
-              </w:rPr>
-              <w:t xml:space="preserve">, </w:t>
-            </w:r>
-            <w:r>
-              <w:rPr>
-                <w:rFonts w:ascii="Consolas" w:hAnsi="Consolas"/>
-                <w:color w:val="1F3A5F"/>
-                <w:sz w:val="17"/>
-              </w:rPr>
-              <w:t>checksums.py</w:t>
-            </w:r>
-            <w:r>
-              <w:rPr>
-                <w:sz w:val="19"/>
-              </w:rPr>
-              <w:t xml:space="preserve">, </w:t>
-            </w:r>
-            <w:r>
-              <w:rPr>
-                <w:rFonts w:ascii="Consolas" w:hAnsi="Consolas"/>
-                <w:color w:val="1F3A5F"/>
-                <w:sz w:val="17"/>
-              </w:rPr>
-              <w:t>address_bounds.py</w:t>
-            </w:r>
-            <w:r>
-              <w:rPr>
-                <w:sz w:val="19"/>
-              </w:rPr>
-              <w:t xml:space="preserve">, </w:t>
-            </w:r>
-            <w:r>
-              <w:rPr>
-                <w:rFonts w:ascii="Consolas" w:hAnsi="Consolas"/>
-                <w:color w:val="1F3A5F"/>
-                <w:sz w:val="17"/>
-              </w:rPr>
-              <w:t>address_patterns.py</w:t>
-            </w:r>
-            <w:r>
-              <w:rPr>
-                <w:sz w:val="19"/>
-              </w:rPr>
-              <w:t xml:space="preserve">, </w:t>
-            </w:r>
-            <w:r>
-              <w:rPr>
-                <w:rFonts w:ascii="Consolas" w:hAnsi="Consolas"/>
-                <w:color w:val="1F3A5F"/>
-                <w:sz w:val="17"/>
-              </w:rPr>
-              <w:t>case_patterns.py</w:t>
-            </w:r>
-            <w:r>
-              <w:rPr>
-                <w:sz w:val="19"/>
-              </w:rPr>
-              <w:t xml:space="preserve">, </w:t>
-            </w:r>
-            <w:r>
-              <w:rPr>
-                <w:rFonts w:ascii="Consolas" w:hAnsi="Consolas"/>
-                <w:color w:val="1F3A5F"/>
-                <w:sz w:val="17"/>
-              </w:rPr>
-              <w:t>labeled_identifiers.py</w:t>
-            </w:r>
-            <w:r>
-              <w:rPr>
-                <w:sz w:val="19"/>
-              </w:rPr>
-              <w:t xml:space="preserve">, </w:t>
-            </w:r>
-            <w:r>
-              <w:rPr>
-                <w:rFonts w:ascii="Consolas" w:hAnsi="Consolas"/>
-                <w:color w:val="1F3A5F"/>
-                <w:sz w:val="17"/>
-              </w:rPr>
-              <w:t>person_heuristics.py</w:t>
-            </w:r>
-          </w:p>
-        </w:tc>
-        <w:tc>
-          <w:tcPr>
-            <w:tcW w:w="1843" w:type="dxa"/>
-          </w:tcPr>
-          <w:p>
-            <w:pPr>
-              <w:spacing w:after="40" w:line="240" w:lineRule="auto"/>
-            </w:pPr>
-            <w:r>
-              <w:rPr>
-                <w:sz w:val="19"/>
-              </w:rPr>
-              <w:t>Analysis view, document language</w:t>
-            </w:r>
-          </w:p>
-        </w:tc>
-        <w:tc>
-          <w:tcPr>
-            <w:tcW w:w="2069" w:type="dxa"/>
-          </w:tcPr>
-          <w:p>
-            <w:pPr>
-              <w:spacing w:after="40" w:line="240" w:lineRule="auto"/>
-            </w:pPr>
-            <w:r>
-              <w:rPr>
-                <w:sz w:val="19"/>
-              </w:rPr>
-              <w:t>Scored candidates</w:t>
-            </w:r>
-          </w:p>
-        </w:tc>
-      </w:tr>
-      <w:tr>
-        <w:trPr>
-          <w:jc w:val="center"/>
-        </w:trPr>
-        <w:tc>
-          <w:tcPr>
-            <w:tcW w:w="2069" w:type="dxa"/>
-            <w:shd w:val="clear" w:color="auto" w:fill="F6F7F9"/>
-          </w:tcPr>
-          <w:p>
-            <w:pPr>
-              <w:spacing w:after="40" w:line="240" w:lineRule="auto"/>
-            </w:pPr>
-            <w:r>
-              <w:rPr>
-                <w:sz w:val="19"/>
-              </w:rPr>
-              <w:t>Statistical models</w:t>
-            </w:r>
-          </w:p>
-        </w:tc>
-        <w:tc>
-          <w:tcPr>
-            <w:tcW w:w="4224" w:type="dxa"/>
-            <w:shd w:val="clear" w:color="auto" w:fill="F6F7F9"/>
-          </w:tcPr>
-          <w:p>
-            <w:pPr>
-              <w:spacing w:after="40" w:line="240" w:lineRule="auto"/>
-            </w:pPr>
-            <w:r>
-              <w:rPr>
-                <w:rFonts w:ascii="Consolas" w:hAnsi="Consolas"/>
-                <w:color w:val="1F3A5F"/>
-                <w:sz w:val="17"/>
-              </w:rPr>
-              <w:t>detection/ner.py</w:t>
-            </w:r>
-            <w:r>
-              <w:rPr>
-                <w:sz w:val="19"/>
-              </w:rPr>
-              <w:t xml:space="preserve"> (spaCy), </w:t>
-            </w:r>
-            <w:r>
-              <w:rPr>
-                <w:rFonts w:ascii="Consolas" w:hAnsi="Consolas"/>
-                <w:color w:val="1F3A5F"/>
-                <w:sz w:val="17"/>
-              </w:rPr>
-              <w:t>camembert.py</w:t>
-            </w:r>
-            <w:r>
-              <w:rPr>
-                <w:sz w:val="19"/>
-              </w:rPr>
-              <w:t xml:space="preserve">, </w:t>
-            </w:r>
-            <w:r>
-              <w:rPr>
-                <w:rFonts w:ascii="Consolas" w:hAnsi="Consolas"/>
-                <w:color w:val="1F3A5F"/>
-                <w:sz w:val="17"/>
-              </w:rPr>
-              <w:t>gliner.py</w:t>
-            </w:r>
-            <w:r>
-              <w:rPr>
-                <w:sz w:val="19"/>
-              </w:rPr>
-              <w:t xml:space="preserve">, </w:t>
-            </w:r>
-            <w:r>
-              <w:rPr>
-                <w:rFonts w:ascii="Consolas" w:hAnsi="Consolas"/>
-                <w:color w:val="1F3A5F"/>
-                <w:sz w:val="17"/>
-              </w:rPr>
-              <w:t>windows.py</w:t>
-            </w:r>
-            <w:r>
-              <w:rPr>
-                <w:sz w:val="19"/>
-              </w:rPr>
-              <w:t xml:space="preserve">, </w:t>
-            </w:r>
-            <w:r>
-              <w:rPr>
-                <w:rFonts w:ascii="Consolas" w:hAnsi="Consolas"/>
-                <w:color w:val="1F3A5F"/>
-                <w:sz w:val="17"/>
-              </w:rPr>
-              <w:t>pii_labels.py</w:t>
-            </w:r>
-            <w:r>
-              <w:rPr>
-                <w:sz w:val="19"/>
-              </w:rPr>
-              <w:t xml:space="preserve">, </w:t>
-            </w:r>
-            <w:r>
-              <w:rPr>
-                <w:rFonts w:ascii="Consolas" w:hAnsi="Consolas"/>
-                <w:color w:val="1F3A5F"/>
-                <w:sz w:val="17"/>
-              </w:rPr>
-              <w:t>languages.py</w:t>
-            </w:r>
-          </w:p>
-        </w:tc>
-        <w:tc>
-          <w:tcPr>
-            <w:tcW w:w="1843" w:type="dxa"/>
-            <w:shd w:val="clear" w:color="auto" w:fill="F6F7F9"/>
-          </w:tcPr>
-          <w:p>
-            <w:pPr>
-              <w:spacing w:after="40" w:line="240" w:lineRule="auto"/>
-            </w:pPr>
-            <w:r>
-              <w:rPr>
-                <w:sz w:val="19"/>
-              </w:rPr>
-              <w:t>Text, language, local model files</w:t>
-            </w:r>
-          </w:p>
-        </w:tc>
-        <w:tc>
-          <w:tcPr>
-            <w:tcW w:w="2069" w:type="dxa"/>
-            <w:shd w:val="clear" w:color="auto" w:fill="F6F7F9"/>
-          </w:tcPr>
-          <w:p>
-            <w:pPr>
-              <w:spacing w:after="40" w:line="240" w:lineRule="auto"/>
-            </w:pPr>
-            <w:r>
-              <w:rPr>
-                <w:sz w:val="19"/>
-              </w:rPr>
-              <w:t>Scored candidates, never downloaded</w:t>
-            </w:r>
-          </w:p>
-        </w:tc>
-      </w:tr>
-      <w:tr>
-        <w:trPr>
-          <w:jc w:val="center"/>
-        </w:trPr>
-        <w:tc>
-          <w:tcPr>
-            <w:tcW w:w="2069" w:type="dxa"/>
-          </w:tcPr>
-          <w:p>
-            <w:pPr>
-              <w:spacing w:after="40" w:line="240" w:lineRule="auto"/>
-            </w:pPr>
-            <w:r>
-              <w:rPr>
-                <w:sz w:val="19"/>
-              </w:rPr>
-              <w:t>Cleaning</w:t>
-            </w:r>
-          </w:p>
-        </w:tc>
-        <w:tc>
-          <w:tcPr>
-            <w:tcW w:w="4224" w:type="dxa"/>
-          </w:tcPr>
-          <w:p>
-            <w:pPr>
-              <w:spacing w:after="40" w:line="240" w:lineRule="auto"/>
-            </w:pPr>
-            <w:r>
-              <w:rPr>
-                <w:rFonts w:ascii="Consolas" w:hAnsi="Consolas"/>
-                <w:color w:val="1F3A5F"/>
-                <w:sz w:val="17"/>
-              </w:rPr>
-              <w:t>detection/analysis_view.py</w:t>
-            </w:r>
-            <w:r>
-              <w:rPr>
-                <w:sz w:val="19"/>
-              </w:rPr>
-              <w:t xml:space="preserve">, </w:t>
-            </w:r>
-            <w:r>
-              <w:rPr>
-                <w:rFonts w:ascii="Consolas" w:hAnsi="Consolas"/>
-                <w:color w:val="1F3A5F"/>
-                <w:sz w:val="17"/>
-              </w:rPr>
-              <w:t>exclusions.py</w:t>
-            </w:r>
-            <w:r>
-              <w:rPr>
-                <w:sz w:val="19"/>
-              </w:rPr>
-              <w:t xml:space="preserve">, </w:t>
-            </w:r>
-            <w:r>
-              <w:rPr>
-                <w:rFonts w:ascii="Consolas" w:hAnsi="Consolas"/>
-                <w:color w:val="1F3A5F"/>
-                <w:sz w:val="17"/>
-              </w:rPr>
-              <w:t>merge.py</w:t>
-            </w:r>
-            <w:r>
-              <w:rPr>
-                <w:sz w:val="19"/>
-              </w:rPr>
-              <w:t xml:space="preserve">, </w:t>
-            </w:r>
-            <w:r>
-              <w:rPr>
-                <w:rFonts w:ascii="Consolas" w:hAnsi="Consolas"/>
-                <w:color w:val="1F3A5F"/>
-                <w:sz w:val="17"/>
-              </w:rPr>
-              <w:t>conflicts.py</w:t>
-            </w:r>
-            <w:r>
-              <w:rPr>
-                <w:sz w:val="19"/>
-              </w:rPr>
-              <w:t xml:space="preserve">, </w:t>
-            </w:r>
-            <w:r>
-              <w:rPr>
-                <w:rFonts w:ascii="Consolas" w:hAnsi="Consolas"/>
-                <w:color w:val="1F3A5F"/>
-                <w:sz w:val="17"/>
-              </w:rPr>
-              <w:t>organization_bounds.py</w:t>
-            </w:r>
-            <w:r>
-              <w:rPr>
-                <w:sz w:val="19"/>
-              </w:rPr>
-              <w:t xml:space="preserve">, </w:t>
-            </w:r>
-            <w:r>
-              <w:rPr>
-                <w:rFonts w:ascii="Consolas" w:hAnsi="Consolas"/>
-                <w:color w:val="1F3A5F"/>
-                <w:sz w:val="17"/>
-              </w:rPr>
-              <w:t>aliases.py</w:t>
-            </w:r>
-            <w:r>
-              <w:rPr>
-                <w:sz w:val="19"/>
-              </w:rPr>
-              <w:t xml:space="preserve">, </w:t>
-            </w:r>
-            <w:r>
-              <w:rPr>
-                <w:rFonts w:ascii="Consolas" w:hAnsi="Consolas"/>
-                <w:color w:val="1F3A5F"/>
-                <w:sz w:val="17"/>
-              </w:rPr>
-              <w:t>propagation.py</w:t>
-            </w:r>
-          </w:p>
-        </w:tc>
-        <w:tc>
-          <w:tcPr>
-            <w:tcW w:w="1843" w:type="dxa"/>
-          </w:tcPr>
-          <w:p>
-            <w:pPr>
-              <w:spacing w:after="40" w:line="240" w:lineRule="auto"/>
-            </w:pPr>
-            <w:r>
-              <w:rPr>
-                <w:sz w:val="19"/>
-              </w:rPr>
-              <w:t>All candidates</w:t>
-            </w:r>
-          </w:p>
-        </w:tc>
-        <w:tc>
-          <w:tcPr>
-            <w:tcW w:w="2069" w:type="dxa"/>
-          </w:tcPr>
-          <w:p>
-            <w:pPr>
-              <w:spacing w:after="40" w:line="240" w:lineRule="auto"/>
-            </w:pPr>
-            <w:r>
-              <w:rPr>
-                <w:sz w:val="19"/>
-              </w:rPr>
-              <w:t>Sorted detections without overlap</w:t>
-            </w:r>
-          </w:p>
-        </w:tc>
-      </w:tr>
-      <w:tr>
-        <w:trPr>
-          <w:jc w:val="center"/>
-        </w:trPr>
-        <w:tc>
-          <w:tcPr>
-            <w:tcW w:w="2069" w:type="dxa"/>
-            <w:shd w:val="clear" w:color="auto" w:fill="F6F7F9"/>
-          </w:tcPr>
-          <w:p>
-            <w:pPr>
-              <w:spacing w:after="40" w:line="240" w:lineRule="auto"/>
-            </w:pPr>
-            <w:r>
-              <w:rPr>
-                <w:sz w:val="19"/>
-              </w:rPr>
-              <w:t>Orchestration</w:t>
-            </w:r>
-          </w:p>
-        </w:tc>
-        <w:tc>
-          <w:tcPr>
-            <w:tcW w:w="4224" w:type="dxa"/>
-            <w:shd w:val="clear" w:color="auto" w:fill="F6F7F9"/>
-          </w:tcPr>
-          <w:p>
-            <w:pPr>
-              <w:spacing w:after="40" w:line="240" w:lineRule="auto"/>
-            </w:pPr>
-            <w:r>
-              <w:rPr>
-                <w:rFonts w:ascii="Consolas" w:hAnsi="Consolas"/>
-                <w:color w:val="1F3A5F"/>
-                <w:sz w:val="17"/>
-              </w:rPr>
-              <w:t>detection/pipeline.py</w:t>
-            </w:r>
-            <w:r>
-              <w:rPr>
-                <w:sz w:val="19"/>
-              </w:rPr>
-              <w:t xml:space="preserve">, function </w:t>
-            </w:r>
-            <w:r>
-              <w:rPr>
-                <w:rFonts w:ascii="Consolas" w:hAnsi="Consolas"/>
-                <w:color w:val="1F3A5F"/>
-                <w:sz w:val="17"/>
-              </w:rPr>
-              <w:t>detect(text, config, known)</w:t>
-            </w:r>
-          </w:p>
-        </w:tc>
-        <w:tc>
-          <w:tcPr>
-            <w:tcW w:w="1843" w:type="dxa"/>
-            <w:shd w:val="clear" w:color="auto" w:fill="F6F7F9"/>
-          </w:tcPr>
-          <w:p>
-            <w:pPr>
-              <w:spacing w:after="40" w:line="240" w:lineRule="auto"/>
-            </w:pPr>
-            <w:r>
-              <w:rPr>
-                <w:sz w:val="19"/>
-              </w:rPr>
-              <w:t>Text, configuration, known values</w:t>
-            </w:r>
-          </w:p>
-        </w:tc>
-        <w:tc>
-          <w:tcPr>
-            <w:tcW w:w="2069" w:type="dxa"/>
-            <w:shd w:val="clear" w:color="auto" w:fill="F6F7F9"/>
-          </w:tcPr>
-          <w:p>
-            <w:pPr>
-              <w:spacing w:after="40" w:line="240" w:lineRule="auto"/>
-            </w:pPr>
-            <w:r>
-              <w:rPr>
-                <w:sz w:val="19"/>
-              </w:rPr>
-              <w:t xml:space="preserve">The list of </w:t>
-            </w:r>
-            <w:r>
-              <w:rPr>
-                <w:rFonts w:ascii="Consolas" w:hAnsi="Consolas"/>
-                <w:color w:val="1F3A5F"/>
-                <w:sz w:val="17"/>
-              </w:rPr>
-              <w:t>Detection</w:t>
-            </w:r>
-            <w:r>
-              <w:rPr>
-                <w:sz w:val="19"/>
-              </w:rPr>
-              <w:t xml:space="preserve"> shown in Review</w:t>
-            </w:r>
-          </w:p>
-        </w:tc>
-      </w:tr>
-      <w:tr>
-        <w:trPr>
-          <w:jc w:val="center"/>
-        </w:trPr>
-        <w:tc>
-          <w:tcPr>
-            <w:tcW w:w="2069" w:type="dxa"/>
-          </w:tcPr>
-          <w:p>
-            <w:pPr>
-              <w:spacing w:after="40" w:line="240" w:lineRule="auto"/>
-            </w:pPr>
-            <w:r>
-              <w:rPr>
-                <w:sz w:val="19"/>
-              </w:rPr>
-              <w:t>Pseudonymisation</w:t>
-            </w:r>
-          </w:p>
-        </w:tc>
-        <w:tc>
-          <w:tcPr>
-            <w:tcW w:w="4224" w:type="dxa"/>
-          </w:tcPr>
-          <w:p>
-            <w:pPr>
-              <w:spacing w:after="40" w:line="240" w:lineRule="auto"/>
-            </w:pPr>
-            <w:r>
-              <w:rPr>
-                <w:rFonts w:ascii="Consolas" w:hAnsi="Consolas"/>
-                <w:color w:val="1F3A5F"/>
-                <w:sz w:val="17"/>
-              </w:rPr>
-              <w:t>pseudonymize/grouping.py</w:t>
-            </w:r>
-            <w:r>
-              <w:rPr>
-                <w:sz w:val="19"/>
-              </w:rPr>
-              <w:t xml:space="preserve">, </w:t>
-            </w:r>
-            <w:r>
-              <w:rPr>
-                <w:rFonts w:ascii="Consolas" w:hAnsi="Consolas"/>
-                <w:color w:val="1F3A5F"/>
-                <w:sz w:val="17"/>
-              </w:rPr>
-              <w:t>tokens.py</w:t>
-            </w:r>
-            <w:r>
-              <w:rPr>
-                <w:sz w:val="19"/>
-              </w:rPr>
-              <w:t xml:space="preserve">, </w:t>
-            </w:r>
-            <w:r>
-              <w:rPr>
-                <w:rFonts w:ascii="Consolas" w:hAnsi="Consolas"/>
-                <w:color w:val="1F3A5F"/>
-                <w:sz w:val="17"/>
-              </w:rPr>
-              <w:t>mapping.py</w:t>
-            </w:r>
-            <w:r>
-              <w:rPr>
-                <w:sz w:val="19"/>
-              </w:rPr>
-              <w:t xml:space="preserve">, </w:t>
-            </w:r>
-            <w:r>
-              <w:rPr>
-                <w:rFonts w:ascii="Consolas" w:hAnsi="Consolas"/>
-                <w:color w:val="1F3A5F"/>
-                <w:sz w:val="17"/>
-              </w:rPr>
-              <w:t>case_memory.py</w:t>
-            </w:r>
-          </w:p>
-        </w:tc>
-        <w:tc>
-          <w:tcPr>
-            <w:tcW w:w="1843" w:type="dxa"/>
-          </w:tcPr>
-          <w:p>
-            <w:pPr>
-              <w:spacing w:after="40" w:line="240" w:lineRule="auto"/>
-            </w:pPr>
-            <w:r>
-              <w:rPr>
-                <w:sz w:val="19"/>
-              </w:rPr>
-              <w:t>Reviewed detections</w:t>
-            </w:r>
-          </w:p>
-        </w:tc>
-        <w:tc>
-          <w:tcPr>
-            <w:tcW w:w="2069" w:type="dxa"/>
-          </w:tcPr>
-          <w:p>
-            <w:pPr>
-              <w:spacing w:after="40" w:line="240" w:lineRule="auto"/>
-            </w:pPr>
-            <w:r>
-              <w:rPr>
-                <w:sz w:val="19"/>
-              </w:rPr>
-              <w:t>Tokenised text, groups, mapping table</w:t>
-            </w:r>
-          </w:p>
-        </w:tc>
-      </w:tr>
-      <w:tr>
-        <w:trPr>
-          <w:jc w:val="center"/>
-        </w:trPr>
-        <w:tc>
-          <w:tcPr>
-            <w:tcW w:w="2069" w:type="dxa"/>
-            <w:shd w:val="clear" w:color="auto" w:fill="F6F7F9"/>
-          </w:tcPr>
-          <w:p>
-            <w:pPr>
-              <w:spacing w:after="40" w:line="240" w:lineRule="auto"/>
-            </w:pPr>
-            <w:r>
-              <w:rPr>
-                <w:sz w:val="19"/>
-              </w:rPr>
-              <w:t>Checks</w:t>
-            </w:r>
-          </w:p>
-        </w:tc>
-        <w:tc>
-          <w:tcPr>
-            <w:tcW w:w="4224" w:type="dxa"/>
-            <w:shd w:val="clear" w:color="auto" w:fill="F6F7F9"/>
-          </w:tcPr>
-          <w:p>
-            <w:pPr>
-              <w:spacing w:after="40" w:line="240" w:lineRule="auto"/>
-            </w:pPr>
-            <w:r>
-              <w:rPr>
-                <w:rFonts w:ascii="Consolas" w:hAnsi="Consolas"/>
-                <w:color w:val="1F3A5F"/>
-                <w:sz w:val="17"/>
-              </w:rPr>
-              <w:t>pseudonymize/final_check.py</w:t>
-            </w:r>
-            <w:r>
-              <w:rPr>
-                <w:sz w:val="19"/>
-              </w:rPr>
-              <w:t xml:space="preserve">, </w:t>
-            </w:r>
-            <w:r>
-              <w:rPr>
-                <w:rFonts w:ascii="Consolas" w:hAnsi="Consolas"/>
-                <w:color w:val="1F3A5F"/>
-                <w:sz w:val="17"/>
-              </w:rPr>
-              <w:t>outbound_check.py</w:t>
-            </w:r>
-          </w:p>
-        </w:tc>
-        <w:tc>
-          <w:tcPr>
-            <w:tcW w:w="1843" w:type="dxa"/>
-            <w:shd w:val="clear" w:color="auto" w:fill="F6F7F9"/>
-          </w:tcPr>
-          <w:p>
-            <w:pPr>
-              <w:spacing w:after="40" w:line="240" w:lineRule="auto"/>
-            </w:pPr>
-            <w:r>
-              <w:rPr>
-                <w:sz w:val="19"/>
-              </w:rPr>
-              <w:t>Tokenised text, instruction, original text</w:t>
-            </w:r>
-          </w:p>
-        </w:tc>
-        <w:tc>
-          <w:tcPr>
-            <w:tcW w:w="2069" w:type="dxa"/>
-            <w:shd w:val="clear" w:color="auto" w:fill="F6F7F9"/>
-          </w:tcPr>
-          <w:p>
-            <w:pPr>
-              <w:spacing w:after="40" w:line="240" w:lineRule="auto"/>
-            </w:pPr>
-            <w:r>
-              <w:rPr>
-                <w:sz w:val="19"/>
-              </w:rPr>
-              <w:t>Exact outgoing message, alerts, status</w:t>
-            </w:r>
-          </w:p>
-        </w:tc>
-      </w:tr>
-      <w:tr>
-        <w:trPr>
-          <w:jc w:val="center"/>
-        </w:trPr>
-        <w:tc>
-          <w:tcPr>
-            <w:tcW w:w="2069" w:type="dxa"/>
-          </w:tcPr>
-          <w:p>
-            <w:pPr>
-              <w:spacing w:after="40" w:line="240" w:lineRule="auto"/>
-            </w:pPr>
-            <w:r>
-              <w:rPr>
-                <w:sz w:val="19"/>
-              </w:rPr>
-              <w:t>Restoration</w:t>
-            </w:r>
-          </w:p>
-        </w:tc>
-        <w:tc>
-          <w:tcPr>
-            <w:tcW w:w="4224" w:type="dxa"/>
-          </w:tcPr>
-          <w:p>
-            <w:pPr>
-              <w:spacing w:after="40" w:line="240" w:lineRule="auto"/>
-            </w:pPr>
-            <w:r>
-              <w:rPr>
-                <w:rFonts w:ascii="Consolas" w:hAnsi="Consolas"/>
-                <w:color w:val="1F3A5F"/>
-                <w:sz w:val="17"/>
-              </w:rPr>
-              <w:t>pseudonymize/reidentify.py</w:t>
-            </w:r>
-            <w:r>
-              <w:rPr>
-                <w:sz w:val="19"/>
-              </w:rPr>
-              <w:t xml:space="preserve">, function </w:t>
-            </w:r>
-            <w:r>
-              <w:rPr>
-                <w:rFonts w:ascii="Consolas" w:hAnsi="Consolas"/>
-                <w:color w:val="1F3A5F"/>
-                <w:sz w:val="17"/>
-              </w:rPr>
-              <w:t>restore</w:t>
-            </w:r>
-          </w:p>
-        </w:tc>
-        <w:tc>
-          <w:tcPr>
-            <w:tcW w:w="1843" w:type="dxa"/>
-          </w:tcPr>
-          <w:p>
-            <w:pPr>
-              <w:spacing w:after="40" w:line="240" w:lineRule="auto"/>
-            </w:pPr>
-            <w:r>
-              <w:rPr>
-                <w:sz w:val="19"/>
-              </w:rPr>
-              <w:t>Answer and table</w:t>
-            </w:r>
-          </w:p>
-        </w:tc>
-        <w:tc>
-          <w:tcPr>
-            <w:tcW w:w="2069" w:type="dxa"/>
-          </w:tcPr>
-          <w:p>
-            <w:pPr>
-              <w:spacing w:after="40" w:line="240" w:lineRule="auto"/>
-            </w:pPr>
-            <w:r>
-              <w:rPr>
-                <w:sz w:val="19"/>
-              </w:rPr>
-              <w:t>Restored text, exact or tolerant mode, unknown tokens</w:t>
-            </w:r>
-          </w:p>
-        </w:tc>
-      </w:tr>
-      <w:tr>
-        <w:trPr>
-          <w:jc w:val="center"/>
-        </w:trPr>
-        <w:tc>
-          <w:tcPr>
-            <w:tcW w:w="2069" w:type="dxa"/>
-            <w:shd w:val="clear" w:color="auto" w:fill="F6F7F9"/>
-          </w:tcPr>
-          <w:p>
-            <w:pPr>
-              <w:spacing w:after="40" w:line="240" w:lineRule="auto"/>
-            </w:pPr>
-            <w:r>
-              <w:rPr>
-                <w:sz w:val="19"/>
-              </w:rPr>
-              <w:t>Connector</w:t>
-            </w:r>
-          </w:p>
-        </w:tc>
-        <w:tc>
-          <w:tcPr>
-            <w:tcW w:w="4224" w:type="dxa"/>
-            <w:shd w:val="clear" w:color="auto" w:fill="F6F7F9"/>
-          </w:tcPr>
-          <w:p>
-            <w:pPr>
-              <w:spacing w:after="40" w:line="240" w:lineRule="auto"/>
-            </w:pPr>
-            <w:r>
-              <w:rPr>
-                <w:rFonts w:ascii="Consolas" w:hAnsi="Consolas"/>
-                <w:color w:val="1F3A5F"/>
-                <w:sz w:val="17"/>
-              </w:rPr>
-              <w:t>src/huisclos/llm/mistral_client.py</w:t>
-            </w:r>
-            <w:r>
-              <w:rPr>
-                <w:sz w:val="19"/>
-              </w:rPr>
-              <w:t xml:space="preserve">, </w:t>
-            </w:r>
-            <w:r>
-              <w:rPr>
-                <w:rFonts w:ascii="Consolas" w:hAnsi="Consolas"/>
-                <w:color w:val="1F3A5F"/>
-                <w:sz w:val="17"/>
-              </w:rPr>
-              <w:t>send_outbound</w:t>
-            </w:r>
-          </w:p>
-        </w:tc>
-        <w:tc>
-          <w:tcPr>
-            <w:tcW w:w="1843" w:type="dxa"/>
-            <w:shd w:val="clear" w:color="auto" w:fill="F6F7F9"/>
-          </w:tcPr>
-          <w:p>
-            <w:pPr>
-              <w:spacing w:after="40" w:line="240" w:lineRule="auto"/>
-            </w:pPr>
-            <w:r>
-              <w:rPr>
-                <w:sz w:val="19"/>
-              </w:rPr>
-              <w:t>Checked message, API key</w:t>
-            </w:r>
-          </w:p>
-        </w:tc>
-        <w:tc>
-          <w:tcPr>
-            <w:tcW w:w="2069" w:type="dxa"/>
-            <w:shd w:val="clear" w:color="auto" w:fill="F6F7F9"/>
-          </w:tcPr>
-          <w:p>
-            <w:pPr>
-              <w:spacing w:after="40" w:line="240" w:lineRule="auto"/>
-            </w:pPr>
-            <w:r>
-              <w:rPr>
-                <w:sz w:val="19"/>
-              </w:rPr>
-              <w:t>Model answer or clear error</w:t>
-            </w:r>
-          </w:p>
-        </w:tc>
-      </w:tr>
-      <w:tr>
-        <w:trPr>
-          <w:jc w:val="center"/>
-        </w:trPr>
-        <w:tc>
-          <w:tcPr>
-            <w:tcW w:w="2069" w:type="dxa"/>
-          </w:tcPr>
-          <w:p>
-            <w:pPr>
-              <w:spacing w:after="40" w:line="240" w:lineRule="auto"/>
-            </w:pPr>
-            <w:r>
-              <w:rPr>
-                <w:sz w:val="19"/>
-              </w:rPr>
-              <w:t>Evaluation</w:t>
-            </w:r>
-          </w:p>
-        </w:tc>
-        <w:tc>
-          <w:tcPr>
-            <w:tcW w:w="4224" w:type="dxa"/>
-          </w:tcPr>
-          <w:p>
-            <w:pPr>
-              <w:spacing w:after="40" w:line="240" w:lineRule="auto"/>
-            </w:pPr>
-            <w:r>
-              <w:rPr>
-                <w:rFonts w:ascii="Consolas" w:hAnsi="Consolas"/>
-                <w:color w:val="1F3A5F"/>
-                <w:sz w:val="17"/>
-              </w:rPr>
-              <w:t>src/huisclos/evaluation/</w:t>
-            </w:r>
-            <w:r>
-              <w:rPr>
-                <w:sz w:val="19"/>
-              </w:rPr>
-              <w:t xml:space="preserve">, </w:t>
-            </w:r>
-            <w:r>
-              <w:rPr>
-                <w:rFonts w:ascii="Consolas" w:hAnsi="Consolas"/>
-                <w:color w:val="1F3A5F"/>
-                <w:sz w:val="17"/>
-              </w:rPr>
-              <w:t>scripts/run_evaluation.py</w:t>
-            </w:r>
-            <w:r>
-              <w:rPr>
-                <w:sz w:val="19"/>
-              </w:rPr>
-              <w:t xml:space="preserve">, </w:t>
-            </w:r>
-            <w:r>
-              <w:rPr>
-                <w:rFonts w:ascii="Consolas" w:hAnsi="Consolas"/>
-                <w:color w:val="1F3A5F"/>
-                <w:sz w:val="17"/>
-              </w:rPr>
-              <w:lastRenderedPageBreak/>
-              <w:t>scripts/evaluate_robustness.py</w:t>
-            </w:r>
-          </w:p>
-        </w:tc>
-        <w:tc>
-          <w:tcPr>
-            <w:tcW w:w="1843" w:type="dxa"/>
-          </w:tcPr>
-          <w:p>
-            <w:pPr>
-              <w:spacing w:after="40" w:line="240" w:lineRule="auto"/>
-            </w:pPr>
-            <w:r>
-              <w:rPr>
-                <w:sz w:val="19"/>
-              </w:rPr>
-              <w:lastRenderedPageBreak/>
               <w:t>Fictitious annotated corpus</w:t>
             </w:r>
           </w:p>
@@ -3386,7 +3586,7 @@
       <w:pPr>
         <w:pStyle w:val="Titre1"/>
       </w:pPr>
-      <w:bookmarkStart w:id="5" w:name="_Toc244123708"/>
+      <w:bookmarkStart w:id="5" w:name="_Toc244124677"/>
       <w:r>
         <w:t>6. Three independent settings</w:t>
       </w:r>
@@ -3482,8 +3682,9 @@
       <w:pPr>
         <w:pStyle w:val="Titre1"/>
       </w:pPr>
-      <w:bookmarkStart w:id="6" w:name="_Toc244123709"/>
+      <w:bookmarkStart w:id="6" w:name="_Toc244124678"/>
       <w:r>
+        <w:lastRenderedPageBreak/>
         <w:t>7. Profiles and explicit fallback</w:t>
       </w:r>
       <w:bookmarkEnd w:id="6"/>
@@ -3510,6 +3711,7 @@
       </w:tblGrid>
       <w:tr>
         <w:trPr>
+          <w:cantSplit/>
           <w:tblHeader/>
           <w:jc w:val="center"/>
         </w:trPr>
@@ -3520,6 +3722,7 @@
           </w:tcPr>
           <w:p>
             <w:pPr>
+              <w:keepNext/>
               <w:spacing w:after="40" w:line="240" w:lineRule="auto"/>
             </w:pPr>
             <w:r>
@@ -3539,6 +3742,7 @@
           </w:tcPr>
           <w:p>
             <w:pPr>
+              <w:keepNext/>
               <w:spacing w:after="40" w:line="240" w:lineRule="auto"/>
             </w:pPr>
             <w:r>
@@ -3558,6 +3762,7 @@
           </w:tcPr>
           <w:p>
             <w:pPr>
+              <w:keepNext/>
               <w:spacing w:after="40" w:line="240" w:lineRule="auto"/>
             </w:pPr>
             <w:r>
@@ -3573,6 +3778,7 @@
       </w:tr>
       <w:tr>
         <w:trPr>
+          <w:cantSplit/>
           <w:jc w:val="center"/>
         </w:trPr>
         <w:tc>
@@ -3581,6 +3787,7 @@
           </w:tcPr>
           <w:p>
             <w:pPr>
+              <w:keepNext/>
               <w:spacing w:after="40" w:line="240" w:lineRule="auto"/>
             </w:pPr>
             <w:r>
@@ -3597,6 +3804,7 @@
           </w:tcPr>
           <w:p>
             <w:pPr>
+              <w:keepNext/>
               <w:spacing w:after="40" w:line="240" w:lineRule="auto"/>
             </w:pPr>
             <w:r>
@@ -3613,6 +3821,7 @@
           </w:tcPr>
           <w:p>
             <w:pPr>
+              <w:keepNext/>
               <w:spacing w:after="40" w:line="240" w:lineRule="auto"/>
             </w:pPr>
             <w:r>
@@ -3626,6 +3835,7 @@
       </w:tr>
       <w:tr>
         <w:trPr>
+          <w:cantSplit/>
           <w:jc w:val="center"/>
         </w:trPr>
         <w:tc>
@@ -3695,7 +3905,7 @@
       <w:pPr>
         <w:pStyle w:val="Titre1"/>
       </w:pPr>
-      <w:bookmarkStart w:id="7" w:name="_Toc244123710"/>
+      <w:bookmarkStart w:id="7" w:name="_Toc244124679"/>
       <w:r>
         <w:t>8. Stale states</w:t>
       </w:r>
@@ -3742,7 +3952,7 @@
       <w:pPr>
         <w:pStyle w:val="Titre1"/>
       </w:pPr>
-      <w:bookmarkStart w:id="8" w:name="_Toc244123711"/>
+      <w:bookmarkStart w:id="8" w:name="_Toc244124680"/>
       <w:r>
         <w:t>9. Error handling</w:t>
       </w:r>
@@ -3823,7 +4033,6 @@
         <w:rPr>
           <w:b/>
         </w:rPr>
-        <w:lastRenderedPageBreak/>
         <w:t>Tables</w:t>
       </w:r>
       <w:r>
@@ -3848,8 +4057,9 @@
       <w:pPr>
         <w:pStyle w:val="Titre1"/>
       </w:pPr>
-      <w:bookmarkStart w:id="9" w:name="_Toc244123712"/>
+      <w:bookmarkStart w:id="9" w:name="_Toc244124681"/>
       <w:r>
+        <w:lastRenderedPageBreak/>
         <w:t>10. Where to change what after the freeze</w:t>
       </w:r>
       <w:bookmarkEnd w:id="9"/>
@@ -3876,6 +4086,7 @@
       </w:tblGrid>
       <w:tr>
         <w:trPr>
+          <w:cantSplit/>
           <w:tblHeader/>
           <w:jc w:val="center"/>
         </w:trPr>
@@ -3886,6 +4097,7 @@
           </w:tcPr>
           <w:p>
             <w:pPr>
+              <w:keepNext/>
               <w:spacing w:after="40" w:line="240" w:lineRule="auto"/>
             </w:pPr>
             <w:r>
@@ -3905,6 +4117,7 @@
           </w:tcPr>
           <w:p>
             <w:pPr>
+              <w:keepNext/>
               <w:spacing w:after="40" w:line="240" w:lineRule="auto"/>
             </w:pPr>
             <w:r>
@@ -3924,6 +4137,7 @@
           </w:tcPr>
           <w:p>
             <w:pPr>
+              <w:keepNext/>
               <w:spacing w:after="40" w:line="240" w:lineRule="auto"/>
             </w:pPr>
             <w:r>
@@ -3939,6 +4153,7 @@
       </w:tr>
       <w:tr>
         <w:trPr>
+          <w:cantSplit/>
           <w:jc w:val="center"/>
         </w:trPr>
         <w:tc>
@@ -3947,6 +4162,7 @@
           </w:tcPr>
           <w:p>
             <w:pPr>
+              <w:keepNext/>
               <w:spacing w:after="40" w:line="240" w:lineRule="auto"/>
             </w:pPr>
             <w:r>
@@ -3963,6 +4179,7 @@
           </w:tcPr>
           <w:p>
             <w:pPr>
+              <w:keepNext/>
               <w:spacing w:after="40" w:line="240" w:lineRule="auto"/>
             </w:pPr>
             <w:r>
@@ -3987,6 +4204,7 @@
           </w:tcPr>
           <w:p>
             <w:pPr>
+              <w:keepNext/>
               <w:spacing w:after="40" w:line="240" w:lineRule="auto"/>
             </w:pPr>
             <w:r>
@@ -4000,6 +4218,7 @@
       </w:tr>
       <w:tr>
         <w:trPr>
+          <w:cantSplit/>
           <w:jc w:val="center"/>
         </w:trPr>
         <w:tc>
@@ -4009,6 +4228,7 @@
           </w:tcPr>
           <w:p>
             <w:pPr>
+              <w:keepNext/>
               <w:spacing w:after="40" w:line="240" w:lineRule="auto"/>
             </w:pPr>
             <w:r>
@@ -4026,6 +4246,7 @@
           </w:tcPr>
           <w:p>
             <w:pPr>
+              <w:keepNext/>
               <w:spacing w:after="40" w:line="240" w:lineRule="auto"/>
             </w:pPr>
             <w:r>
@@ -4059,6 +4280,7 @@
           </w:tcPr>
           <w:p>
             <w:pPr>
+              <w:keepNext/>
               <w:spacing w:after="40" w:line="240" w:lineRule="auto"/>
             </w:pPr>
             <w:r>
@@ -4072,6 +4294,7 @@
       </w:tr>
       <w:tr>
         <w:trPr>
+          <w:cantSplit/>
           <w:jc w:val="center"/>
         </w:trPr>
         <w:tc>
@@ -4080,6 +4303,7 @@
           </w:tcPr>
           <w:p>
             <w:pPr>
+              <w:keepNext/>
               <w:spacing w:after="40" w:line="240" w:lineRule="auto"/>
             </w:pPr>
             <w:r>
@@ -4096,6 +4320,7 @@
           </w:tcPr>
           <w:p>
             <w:pPr>
+              <w:keepNext/>
               <w:spacing w:after="40" w:line="240" w:lineRule="auto"/>
             </w:pPr>
             <w:r>
@@ -4128,6 +4353,7 @@
           </w:tcPr>
           <w:p>
             <w:pPr>
+              <w:keepNext/>
               <w:spacing w:after="40" w:line="240" w:lineRule="auto"/>
             </w:pPr>
             <w:r>
@@ -4141,6 +4367,7 @@
       </w:tr>
       <w:tr>
         <w:trPr>
+          <w:cantSplit/>
           <w:jc w:val="center"/>
         </w:trPr>
         <w:tc>
@@ -4150,6 +4377,7 @@
           </w:tcPr>
           <w:p>
             <w:pPr>
+              <w:keepNext/>
               <w:spacing w:after="40" w:line="240" w:lineRule="auto"/>
             </w:pPr>
             <w:r>
@@ -4167,6 +4395,7 @@
           </w:tcPr>
           <w:p>
             <w:pPr>
+              <w:keepNext/>
               <w:spacing w:after="40" w:line="240" w:lineRule="auto"/>
             </w:pPr>
             <w:r>
@@ -4200,6 +4429,7 @@
           </w:tcPr>
           <w:p>
             <w:pPr>
+              <w:keepNext/>
               <w:spacing w:after="40" w:line="240" w:lineRule="auto"/>
             </w:pPr>
             <w:r>
@@ -4213,6 +4443,7 @@
       </w:tr>
       <w:tr>
         <w:trPr>
+          <w:cantSplit/>
           <w:jc w:val="center"/>
         </w:trPr>
         <w:tc>
@@ -4221,6 +4452,7 @@
           </w:tcPr>
           <w:p>
             <w:pPr>
+              <w:keepNext/>
               <w:spacing w:after="40" w:line="240" w:lineRule="auto"/>
             </w:pPr>
             <w:r>
@@ -4237,6 +4469,7 @@
           </w:tcPr>
           <w:p>
             <w:pPr>
+              <w:keepNext/>
               <w:spacing w:after="40" w:line="240" w:lineRule="auto"/>
             </w:pPr>
             <w:r>
@@ -4268,6 +4501,7 @@
           </w:tcPr>
           <w:p>
             <w:pPr>
+              <w:keepNext/>
               <w:spacing w:after="40" w:line="240" w:lineRule="auto"/>
             </w:pPr>
             <w:r>
@@ -4281,6 +4515,7 @@
       </w:tr>
       <w:tr>
         <w:trPr>
+          <w:cantSplit/>
           <w:jc w:val="center"/>
         </w:trPr>
         <w:tc>
@@ -4290,6 +4525,7 @@
           </w:tcPr>
           <w:p>
             <w:pPr>
+              <w:keepNext/>
               <w:spacing w:after="40" w:line="240" w:lineRule="auto"/>
             </w:pPr>
             <w:r>
@@ -4307,6 +4543,7 @@
           </w:tcPr>
           <w:p>
             <w:pPr>
+              <w:keepNext/>
               <w:spacing w:after="40" w:line="240" w:lineRule="auto"/>
             </w:pPr>
             <w:r>
@@ -4340,6 +4577,7 @@
           </w:tcPr>
           <w:p>
             <w:pPr>
+              <w:keepNext/>
               <w:spacing w:after="40" w:line="240" w:lineRule="auto"/>
             </w:pPr>
             <w:r>
@@ -4353,6 +4591,7 @@
       </w:tr>
       <w:tr>
         <w:trPr>
+          <w:cantSplit/>
           <w:jc w:val="center"/>
         </w:trPr>
         <w:tc>
@@ -4437,7 +4676,7 @@
       <w:pPr>
         <w:pStyle w:val="Titre1"/>
       </w:pPr>
-      <w:bookmarkStart w:id="10" w:name="_Toc244123713"/>
+      <w:bookmarkStart w:id="10" w:name="_Toc244124682"/>
       <w:r>
         <w:t>11. Glossary</w:t>
       </w:r>
@@ -4728,7 +4967,6 @@
         <w:rPr>
           <w:b/>
         </w:rPr>
-        <w:lastRenderedPageBreak/>
         <w:t>Presidio</w:t>
       </w:r>
       <w:r>
@@ -4764,8 +5002,8 @@
       </w:r>
     </w:p>
     <w:sectPr>
-      <w:headerReference w:type="default" r:id="rId11"/>
-      <w:footerReference w:type="default" r:id="rId12"/>
+      <w:headerReference w:type="default" r:id="rId13"/>
+      <w:footerReference w:type="default" r:id="rId14"/>
       <w:pgSz w:w="11906" w:h="16838"/>
       <w:pgMar w:top="1247" w:right="1247" w:bottom="1134" w:left="1247" w:header="720" w:footer="720" w:gutter="0"/>
       <w:cols w:space="720"/>
@@ -5112,34 +5350,34 @@
       </w:rPr>
     </w:lvl>
   </w:abstractNum>
-  <w:num w:numId="1" w16cid:durableId="591550142">
+  <w:num w:numId="1" w16cid:durableId="305473691">
     <w:abstractNumId w:val="8"/>
   </w:num>
-  <w:num w:numId="2" w16cid:durableId="1763574963">
+  <w:num w:numId="2" w16cid:durableId="741221168">
     <w:abstractNumId w:val="6"/>
   </w:num>
-  <w:num w:numId="3" w16cid:durableId="2037540906">
+  <w:num w:numId="3" w16cid:durableId="728309592">
     <w:abstractNumId w:val="5"/>
   </w:num>
-  <w:num w:numId="4" w16cid:durableId="1422871286">
+  <w:num w:numId="4" w16cid:durableId="58486396">
     <w:abstractNumId w:val="4"/>
   </w:num>
-  <w:num w:numId="5" w16cid:durableId="570385298">
+  <w:num w:numId="5" w16cid:durableId="1685864076">
     <w:abstractNumId w:val="7"/>
   </w:num>
-  <w:num w:numId="6" w16cid:durableId="1244292339">
+  <w:num w:numId="6" w16cid:durableId="974601549">
     <w:abstractNumId w:val="3"/>
   </w:num>
-  <w:num w:numId="7" w16cid:durableId="511379648">
+  <w:num w:numId="7" w16cid:durableId="570579319">
     <w:abstractNumId w:val="2"/>
   </w:num>
-  <w:num w:numId="8" w16cid:durableId="678889377">
+  <w:num w:numId="8" w16cid:durableId="392318018">
     <w:abstractNumId w:val="1"/>
   </w:num>
-  <w:num w:numId="9" w16cid:durableId="2036883348">
+  <w:num w:numId="9" w16cid:durableId="1858959443">
     <w:abstractNumId w:val="0"/>
   </w:num>
-  <w:num w:numId="10" w16cid:durableId="1372614535">
+  <w:num w:numId="10" w16cid:durableId="919756200">
     <w:abstractNumId w:val="7"/>
     <w:lvlOverride w:ilvl="0">
       <w:startOverride w:val="1"/>
@@ -16535,7 +16773,7 @@
     <w:autoRedefine/>
     <w:uiPriority w:val="39"/>
     <w:unhideWhenUsed/>
-    <w:rsid w:val="00021BAD"/>
+    <w:rsid w:val="00673C3C"/>
     <w:pPr>
       <w:spacing w:after="100"/>
     </w:pPr>
@@ -16545,7 +16783,7 @@
     <w:basedOn w:val="Policepardfaut"/>
     <w:uiPriority w:val="99"/>
     <w:unhideWhenUsed/>
-    <w:rsid w:val="00021BAD"/>
+    <w:rsid w:val="00673C3C"/>
     <w:rPr>
       <w:color w:val="0000FF" w:themeColor="hyperlink"/>
       <w:u w:val="single"/>

</xml_diff>